<commit_message>
Added Purpose scope and boundary as well as list of stakeholders
</commit_message>
<xml_diff>
--- a/report/CA1.docx
+++ b/report/CA1.docx
@@ -19,113 +19,50 @@
     <w:p>
       <w:pPr>
         <w:pStyle w:val="NoSpacing"/>
-        <w:rPr>
-          <w:sz w:val="22"/>
-          <w:szCs w:val="22"/>
-        </w:rPr>
       </w:pPr>
       <w:r>
-        <w:rPr>
-          <w:sz w:val="22"/>
-          <w:szCs w:val="22"/>
-        </w:rPr>
-        <w:t>Kingdom Community Property Services</w:t>
-      </w:r>
-      <w:r>
-        <w:rPr>
-          <w:sz w:val="22"/>
-          <w:szCs w:val="22"/>
-        </w:rPr>
-        <w:t xml:space="preserve"> (KCPS) is an organization that maintains a mixed portfolio of community buildings, small offices, and rented residential properties.</w:t>
+        <w:t>Kingdom Community Property Services (KCPS) is an organization that maintains a mixed portfolio of community buildings, small offices, and rented residential properties.</w:t>
       </w:r>
     </w:p>
     <w:p>
       <w:pPr>
         <w:pStyle w:val="NoSpacing"/>
-        <w:rPr>
-          <w:sz w:val="22"/>
-          <w:szCs w:val="22"/>
-        </w:rPr>
       </w:pPr>
       <w:r>
-        <w:rPr>
-          <w:sz w:val="22"/>
-          <w:szCs w:val="22"/>
-        </w:rPr>
         <w:t>Requests come from occupants, caretakers, property managers and partner organizations. The work is completed by internal maintenance staff and approved external contractors. Currently, the information for a request is placed across email, spreadsheets, paper job sheets and messaging groups. Photographs, quotations, appointments and completion notes are stored wherever the person handling them happens to keep.</w:t>
       </w:r>
     </w:p>
     <w:p>
       <w:pPr>
         <w:pStyle w:val="NoSpacing"/>
-        <w:rPr>
-          <w:sz w:val="22"/>
-          <w:szCs w:val="22"/>
-        </w:rPr>
       </w:pPr>
     </w:p>
     <w:p>
       <w:pPr>
         <w:pStyle w:val="NoSpacing"/>
-        <w:rPr>
-          <w:sz w:val="22"/>
-          <w:szCs w:val="22"/>
-        </w:rPr>
       </w:pPr>
       <w:r>
-        <w:rPr>
-          <w:sz w:val="22"/>
-          <w:szCs w:val="22"/>
-        </w:rPr>
         <w:t xml:space="preserve">The process is following: </w:t>
       </w:r>
       <w:r>
-        <w:rPr>
-          <w:sz w:val="22"/>
-          <w:szCs w:val="22"/>
-        </w:rPr>
         <w:t xml:space="preserve">reporter describes the problem, </w:t>
       </w:r>
       <w:r>
-        <w:rPr>
-          <w:sz w:val="22"/>
-          <w:szCs w:val="22"/>
-        </w:rPr>
         <w:t xml:space="preserve">staff creates </w:t>
       </w:r>
       <w:r>
-        <w:rPr>
-          <w:sz w:val="22"/>
-          <w:szCs w:val="22"/>
-        </w:rPr>
         <w:t>the</w:t>
       </w:r>
       <w:r>
-        <w:rPr>
-          <w:sz w:val="22"/>
-          <w:szCs w:val="22"/>
-        </w:rPr>
         <w:t xml:space="preserve"> request, assigns it its priority level</w:t>
       </w:r>
       <w:r>
-        <w:rPr>
-          <w:sz w:val="22"/>
-          <w:szCs w:val="22"/>
-        </w:rPr>
         <w:t xml:space="preserve"> and decides whether it is KCPS case or not</w:t>
       </w:r>
       <w:r>
-        <w:rPr>
-          <w:sz w:val="22"/>
-          <w:szCs w:val="22"/>
-        </w:rPr>
         <w:t xml:space="preserve">, </w:t>
       </w:r>
       <w:r>
-        <w:rPr>
-          <w:sz w:val="22"/>
-          <w:szCs w:val="22"/>
-        </w:rPr>
         <w:t xml:space="preserve">the work is allocated to a suitable worker, access is provided, worker is given a relevant contact, one or more visits take place, order parts or recalculate the amount of trade, the request will be closed after completion and providing evidence and confirmation. </w:t>
       </w:r>
     </w:p>
@@ -168,16 +105,8 @@
           <w:p>
             <w:pPr>
               <w:pStyle w:val="NoSpacing"/>
-              <w:rPr>
-                <w:sz w:val="22"/>
-                <w:szCs w:val="22"/>
-              </w:rPr>
-            </w:pPr>
-            <w:r>
-              <w:rPr>
-                <w:sz w:val="22"/>
-                <w:szCs w:val="22"/>
-              </w:rPr>
+            </w:pPr>
+            <w:r>
               <w:t>Problem</w:t>
             </w:r>
           </w:p>
@@ -189,16 +118,8 @@
           <w:p>
             <w:pPr>
               <w:pStyle w:val="NoSpacing"/>
-              <w:rPr>
-                <w:sz w:val="22"/>
-                <w:szCs w:val="22"/>
-              </w:rPr>
-            </w:pPr>
-            <w:r>
-              <w:rPr>
-                <w:sz w:val="22"/>
-                <w:szCs w:val="22"/>
-              </w:rPr>
+            </w:pPr>
+            <w:r>
               <w:t>Consequence</w:t>
             </w:r>
           </w:p>
@@ -212,23 +133,11 @@
           <w:p>
             <w:pPr>
               <w:pStyle w:val="NoSpacing"/>
-              <w:rPr>
-                <w:sz w:val="22"/>
-                <w:szCs w:val="22"/>
-              </w:rPr>
-            </w:pPr>
-            <w:r>
-              <w:rPr>
-                <w:sz w:val="22"/>
-                <w:szCs w:val="22"/>
-              </w:rPr>
+            </w:pPr>
+            <w:r>
               <w:t>Information about request is spread out between email, spreadsheet, paper job sheet and messaging group and its status is not always current</w:t>
             </w:r>
             <w:r>
-              <w:rPr>
-                <w:sz w:val="22"/>
-                <w:szCs w:val="22"/>
-              </w:rPr>
               <w:t>.</w:t>
             </w:r>
           </w:p>
@@ -240,30 +149,14 @@
           <w:p>
             <w:pPr>
               <w:pStyle w:val="NoSpacing"/>
-              <w:rPr>
-                <w:sz w:val="22"/>
-                <w:szCs w:val="22"/>
-              </w:rPr>
-            </w:pPr>
-            <w:r>
-              <w:rPr>
-                <w:sz w:val="22"/>
-                <w:szCs w:val="22"/>
-              </w:rPr>
+            </w:pPr>
+            <w:r>
               <w:t>Staff and reporters can’t trust its status</w:t>
             </w:r>
             <w:r>
-              <w:rPr>
-                <w:sz w:val="22"/>
-                <w:szCs w:val="22"/>
-              </w:rPr>
               <w:t xml:space="preserve"> and a lot of time will be consumed changing information for one request</w:t>
             </w:r>
             <w:r>
-              <w:rPr>
-                <w:sz w:val="22"/>
-                <w:szCs w:val="22"/>
-              </w:rPr>
               <w:t>.</w:t>
             </w:r>
           </w:p>
@@ -277,16 +170,8 @@
           <w:p>
             <w:pPr>
               <w:pStyle w:val="NoSpacing"/>
-              <w:rPr>
-                <w:sz w:val="22"/>
-                <w:szCs w:val="22"/>
-              </w:rPr>
-            </w:pPr>
-            <w:r>
-              <w:rPr>
-                <w:sz w:val="22"/>
-                <w:szCs w:val="22"/>
-              </w:rPr>
+            </w:pPr>
+            <w:r>
               <w:t xml:space="preserve">Different staff members use different descriptions for the same room, asset or fault. </w:t>
             </w:r>
           </w:p>
@@ -298,16 +183,8 @@
           <w:p>
             <w:pPr>
               <w:pStyle w:val="NoSpacing"/>
-              <w:rPr>
-                <w:sz w:val="22"/>
-                <w:szCs w:val="22"/>
-              </w:rPr>
-            </w:pPr>
-            <w:r>
-              <w:rPr>
-                <w:sz w:val="22"/>
-                <w:szCs w:val="22"/>
-              </w:rPr>
+            </w:pPr>
+            <w:r>
               <w:t>Duplicates and repeat faults will be a problem for employees.</w:t>
             </w:r>
           </w:p>
@@ -321,24 +198,9 @@
           <w:p>
             <w:pPr>
               <w:pStyle w:val="NoSpacing"/>
-              <w:rPr>
-                <w:sz w:val="22"/>
-                <w:szCs w:val="22"/>
-              </w:rPr>
-            </w:pPr>
-            <w:r>
-              <w:rPr>
-                <w:sz w:val="22"/>
-                <w:szCs w:val="22"/>
-              </w:rPr>
-              <w:t>The meaning of emergency, urgent and routine is not applied consistently</w:t>
-            </w:r>
-            <w:r>
-              <w:rPr>
-                <w:sz w:val="22"/>
-                <w:szCs w:val="22"/>
-              </w:rPr>
-              <w:t>.</w:t>
+            </w:pPr>
+            <w:r>
+              <w:t>The meaning of emergency, urgent and routine is not applied consistently.</w:t>
             </w:r>
           </w:p>
         </w:tc>
@@ -349,30 +211,14 @@
           <w:p>
             <w:pPr>
               <w:pStyle w:val="NoSpacing"/>
-              <w:rPr>
-                <w:sz w:val="22"/>
-                <w:szCs w:val="22"/>
-              </w:rPr>
-            </w:pPr>
-            <w:r>
-              <w:rPr>
-                <w:sz w:val="22"/>
-                <w:szCs w:val="22"/>
-              </w:rPr>
+            </w:pPr>
+            <w:r>
               <w:t>W</w:t>
             </w:r>
             <w:r>
-              <w:rPr>
-                <w:sz w:val="22"/>
-                <w:szCs w:val="22"/>
-              </w:rPr>
               <w:t>rong interpretation of priority of a property.</w:t>
             </w:r>
             <w:r>
-              <w:rPr>
-                <w:sz w:val="22"/>
-                <w:szCs w:val="22"/>
-              </w:rPr>
               <w:t xml:space="preserve"> May delay critical and rush with routine work. </w:t>
             </w:r>
           </w:p>
@@ -386,16 +232,8 @@
           <w:p>
             <w:pPr>
               <w:pStyle w:val="NoSpacing"/>
-              <w:rPr>
-                <w:sz w:val="22"/>
-                <w:szCs w:val="22"/>
-              </w:rPr>
-            </w:pPr>
-            <w:r>
-              <w:rPr>
-                <w:sz w:val="22"/>
-                <w:szCs w:val="22"/>
-              </w:rPr>
+            </w:pPr>
+            <w:r>
               <w:t>Several reports may concern the same problem, while one report may reveal several separate work items.</w:t>
             </w:r>
           </w:p>
@@ -407,23 +245,11 @@
           <w:p>
             <w:pPr>
               <w:pStyle w:val="NoSpacing"/>
-              <w:rPr>
-                <w:sz w:val="22"/>
-                <w:szCs w:val="22"/>
-              </w:rPr>
-            </w:pPr>
-            <w:r>
-              <w:rPr>
-                <w:sz w:val="22"/>
-                <w:szCs w:val="22"/>
-              </w:rPr>
+            </w:pPr>
+            <w:r>
               <w:t>Effort is duplicated or work items might miss</w:t>
             </w:r>
             <w:r>
-              <w:rPr>
-                <w:sz w:val="22"/>
-                <w:szCs w:val="22"/>
-              </w:rPr>
               <w:t>.</w:t>
             </w:r>
           </w:p>
@@ -437,16 +263,8 @@
           <w:p>
             <w:pPr>
               <w:pStyle w:val="NoSpacing"/>
-              <w:rPr>
-                <w:sz w:val="22"/>
-                <w:szCs w:val="22"/>
-              </w:rPr>
-            </w:pPr>
-            <w:r>
-              <w:rPr>
-                <w:sz w:val="22"/>
-                <w:szCs w:val="22"/>
-              </w:rPr>
+            </w:pPr>
+            <w:r>
               <w:t>Staff do not consistently distinguish no access, occupant cancellation and contractor delay.</w:t>
             </w:r>
           </w:p>
@@ -458,16 +276,8 @@
           <w:p>
             <w:pPr>
               <w:pStyle w:val="NoSpacing"/>
-              <w:rPr>
-                <w:sz w:val="22"/>
-                <w:szCs w:val="22"/>
-              </w:rPr>
-            </w:pPr>
-            <w:r>
-              <w:rPr>
-                <w:sz w:val="22"/>
-                <w:szCs w:val="22"/>
-              </w:rPr>
+            </w:pPr>
+            <w:r>
               <w:t>Responsibility is unclear and wasted visits and can’t be explained.</w:t>
             </w:r>
           </w:p>
@@ -481,16 +291,8 @@
           <w:p>
             <w:pPr>
               <w:pStyle w:val="NoSpacing"/>
-              <w:rPr>
-                <w:sz w:val="22"/>
-                <w:szCs w:val="22"/>
-              </w:rPr>
-            </w:pPr>
-            <w:r>
-              <w:rPr>
-                <w:sz w:val="22"/>
-                <w:szCs w:val="22"/>
-              </w:rPr>
+            </w:pPr>
+            <w:r>
               <w:t>Staff currently use phrases such as fixed, safe for now, awaiting parts and needs another visit without agreed meanings.</w:t>
             </w:r>
           </w:p>
@@ -502,16 +304,8 @@
           <w:p>
             <w:pPr>
               <w:pStyle w:val="NoSpacing"/>
-              <w:rPr>
-                <w:sz w:val="22"/>
-                <w:szCs w:val="22"/>
-              </w:rPr>
-            </w:pPr>
-            <w:r>
-              <w:rPr>
-                <w:sz w:val="22"/>
-                <w:szCs w:val="22"/>
-              </w:rPr>
+            </w:pPr>
+            <w:r>
               <w:t>Temporary repairs may be considered as fixed.</w:t>
             </w:r>
           </w:p>
@@ -525,16 +319,8 @@
           <w:p>
             <w:pPr>
               <w:pStyle w:val="NoSpacing"/>
-              <w:rPr>
-                <w:sz w:val="22"/>
-                <w:szCs w:val="22"/>
-              </w:rPr>
-            </w:pPr>
-            <w:r>
-              <w:rPr>
-                <w:sz w:val="22"/>
-                <w:szCs w:val="22"/>
-              </w:rPr>
+            </w:pPr>
+            <w:r>
               <w:t>Reopened requests are not always linked to the earlier job.</w:t>
             </w:r>
           </w:p>
@@ -546,16 +332,8 @@
           <w:p>
             <w:pPr>
               <w:pStyle w:val="NoSpacing"/>
-              <w:rPr>
-                <w:sz w:val="22"/>
-                <w:szCs w:val="22"/>
-              </w:rPr>
-            </w:pPr>
-            <w:r>
-              <w:rPr>
-                <w:sz w:val="22"/>
-                <w:szCs w:val="22"/>
-              </w:rPr>
+            </w:pPr>
+            <w:r>
               <w:t>Reappearing problems or poor-quality repairs will remain invisible</w:t>
             </w:r>
           </w:p>
@@ -572,16 +350,8 @@
           <w:p>
             <w:pPr>
               <w:pStyle w:val="NoSpacing"/>
-              <w:rPr>
-                <w:sz w:val="22"/>
-                <w:szCs w:val="22"/>
-              </w:rPr>
-            </w:pPr>
-            <w:r>
-              <w:rPr>
-                <w:sz w:val="22"/>
-                <w:szCs w:val="22"/>
-              </w:rPr>
+            </w:pPr>
+            <w:r>
               <w:t>Some properties have several responsible organisations, and it is not always clear who should approve or pay for work.</w:t>
             </w:r>
           </w:p>
@@ -593,16 +363,8 @@
           <w:p>
             <w:pPr>
               <w:pStyle w:val="NoSpacing"/>
-              <w:rPr>
-                <w:sz w:val="22"/>
-                <w:szCs w:val="22"/>
-              </w:rPr>
-            </w:pPr>
-            <w:r>
-              <w:rPr>
-                <w:sz w:val="22"/>
-                <w:szCs w:val="22"/>
-              </w:rPr>
+            </w:pPr>
+            <w:r>
               <w:t>Not clear who must pay for the work</w:t>
             </w:r>
           </w:p>
@@ -619,16 +381,8 @@
           <w:p>
             <w:pPr>
               <w:pStyle w:val="NoSpacing"/>
-              <w:rPr>
-                <w:sz w:val="22"/>
-                <w:szCs w:val="22"/>
-              </w:rPr>
-            </w:pPr>
-            <w:r>
-              <w:rPr>
-                <w:sz w:val="22"/>
-                <w:szCs w:val="22"/>
-              </w:rPr>
+            </w:pPr>
+            <w:r>
               <w:t>Workers may receive more information than needed.</w:t>
             </w:r>
           </w:p>
@@ -640,16 +394,8 @@
           <w:p>
             <w:pPr>
               <w:pStyle w:val="NoSpacing"/>
-              <w:rPr>
-                <w:sz w:val="22"/>
-                <w:szCs w:val="22"/>
-              </w:rPr>
-            </w:pPr>
-            <w:r>
-              <w:rPr>
-                <w:sz w:val="22"/>
-                <w:szCs w:val="22"/>
-              </w:rPr>
+            </w:pPr>
+            <w:r>
               <w:t>Privacy and confidentiality breach.</w:t>
             </w:r>
           </w:p>
@@ -659,19 +405,1181 @@
     <w:p>
       <w:pPr>
         <w:pStyle w:val="NoSpacing"/>
-        <w:rPr>
-          <w:sz w:val="22"/>
-          <w:szCs w:val="22"/>
-        </w:rPr>
       </w:pPr>
     </w:p>
     <w:p/>
     <w:p/>
+    <w:p>
+      <w:pPr>
+        <w:pStyle w:val="Heading2"/>
+      </w:pPr>
+      <w:r>
+        <w:lastRenderedPageBreak/>
+        <w:t>Purpose, Scope and Boundary</w:t>
+      </w:r>
+    </w:p>
+    <w:p>
+      <w:pPr>
+        <w:rPr>
+          <w:lang w:val="en-US"/>
+        </w:rPr>
+      </w:pPr>
+      <w:r>
+        <w:rPr>
+          <w:b/>
+          <w:bCs/>
+          <w:lang w:val="en-US"/>
+        </w:rPr>
+        <w:t xml:space="preserve">Purpose. </w:t>
+      </w:r>
+      <w:r>
+        <w:rPr>
+          <w:lang w:val="en-US"/>
+        </w:rPr>
+        <w:t>The Property Maintenance Request Service gives KCPS one consistent record of each maintenance request from report to confirmed completion. It also handles the coordination of workers and access to properties and the recording of completion of a task, using shared phrases for priority and outcomes.</w:t>
+      </w:r>
+    </w:p>
+    <w:p>
+      <w:pPr>
+        <w:rPr>
+          <w:lang w:val="en-US"/>
+        </w:rPr>
+      </w:pPr>
+    </w:p>
+    <w:tbl>
+      <w:tblPr>
+        <w:tblStyle w:val="TableGrid"/>
+        <w:tblW w:w="0" w:type="auto"/>
+        <w:tblLook w:val="04A0" w:firstRow="1" w:lastRow="0" w:firstColumn="1" w:lastColumn="0" w:noHBand="0" w:noVBand="1"/>
+      </w:tblPr>
+      <w:tblGrid>
+        <w:gridCol w:w="4508"/>
+        <w:gridCol w:w="4508"/>
+      </w:tblGrid>
+      <w:tr>
+        <w:tc>
+          <w:tcPr>
+            <w:tcW w:w="4508" w:type="dxa"/>
+          </w:tcPr>
+          <w:p>
+            <w:r>
+              <w:t>In scope</w:t>
+            </w:r>
+          </w:p>
+        </w:tc>
+        <w:tc>
+          <w:tcPr>
+            <w:tcW w:w="4508" w:type="dxa"/>
+          </w:tcPr>
+          <w:p>
+            <w:r>
+              <w:t>Out of scope</w:t>
+            </w:r>
+          </w:p>
+        </w:tc>
+      </w:tr>
+      <w:tr>
+        <w:tc>
+          <w:tcPr>
+            <w:tcW w:w="4508" w:type="dxa"/>
+          </w:tcPr>
+          <w:p>
+            <w:r>
+              <w:t xml:space="preserve">Receiving </w:t>
+            </w:r>
+            <w:r>
+              <w:t>of maintenance requests</w:t>
+            </w:r>
+          </w:p>
+        </w:tc>
+        <w:tc>
+          <w:tcPr>
+            <w:tcW w:w="4508" w:type="dxa"/>
+          </w:tcPr>
+          <w:p>
+            <w:r>
+              <w:t>Rent staff</w:t>
+            </w:r>
+          </w:p>
+        </w:tc>
+      </w:tr>
+      <w:tr>
+        <w:tc>
+          <w:tcPr>
+            <w:tcW w:w="4508" w:type="dxa"/>
+          </w:tcPr>
+          <w:p>
+            <w:r>
+              <w:t>Priority assessment and redirection</w:t>
+            </w:r>
+          </w:p>
+        </w:tc>
+        <w:tc>
+          <w:tcPr>
+            <w:tcW w:w="4508" w:type="dxa"/>
+          </w:tcPr>
+          <w:p>
+            <w:r>
+              <w:t>Building asset management system</w:t>
+            </w:r>
+          </w:p>
+        </w:tc>
+      </w:tr>
+      <w:tr>
+        <w:tc>
+          <w:tcPr>
+            <w:tcW w:w="4508" w:type="dxa"/>
+          </w:tcPr>
+          <w:p>
+            <w:r>
+              <w:t>Linking duplicate reports and splitting requests into different jobs</w:t>
+            </w:r>
+          </w:p>
+        </w:tc>
+        <w:tc>
+          <w:tcPr>
+            <w:tcW w:w="4508" w:type="dxa"/>
+          </w:tcPr>
+          <w:p>
+            <w:r>
+              <w:t>Contractors payroll</w:t>
+            </w:r>
+          </w:p>
+        </w:tc>
+      </w:tr>
+      <w:tr>
+        <w:tc>
+          <w:tcPr>
+            <w:tcW w:w="4508" w:type="dxa"/>
+          </w:tcPr>
+          <w:p>
+            <w:r>
+              <w:t>Distributing jobs to internal or external contractors</w:t>
+            </w:r>
+          </w:p>
+        </w:tc>
+        <w:tc>
+          <w:tcPr>
+            <w:tcW w:w="4508" w:type="dxa"/>
+          </w:tcPr>
+          <w:p>
+            <w:r>
+              <w:t>Approving contractors to the approved contractors list</w:t>
+            </w:r>
+          </w:p>
+        </w:tc>
+      </w:tr>
+      <w:tr>
+        <w:tc>
+          <w:tcPr>
+            <w:tcW w:w="4508" w:type="dxa"/>
+          </w:tcPr>
+          <w:p>
+            <w:r>
+              <w:t xml:space="preserve">Make records of access management and outcomes </w:t>
+            </w:r>
+          </w:p>
+        </w:tc>
+        <w:tc>
+          <w:tcPr>
+            <w:tcW w:w="4508" w:type="dxa"/>
+          </w:tcPr>
+          <w:p>
+            <w:r>
+              <w:t>Payment process</w:t>
+            </w:r>
+          </w:p>
+        </w:tc>
+      </w:tr>
+      <w:tr>
+        <w:tc>
+          <w:tcPr>
+            <w:tcW w:w="4508" w:type="dxa"/>
+          </w:tcPr>
+          <w:p>
+            <w:r>
+              <w:t xml:space="preserve">Make records of parts that have been used and the evidence of completion </w:t>
+            </w:r>
+          </w:p>
+        </w:tc>
+        <w:tc>
+          <w:tcPr>
+            <w:tcW w:w="4508" w:type="dxa"/>
+          </w:tcPr>
+          <w:p/>
+        </w:tc>
+      </w:tr>
+      <w:tr>
+        <w:tc>
+          <w:tcPr>
+            <w:tcW w:w="4508" w:type="dxa"/>
+          </w:tcPr>
+          <w:p>
+            <w:r>
+              <w:t>Management of recurring problems</w:t>
+            </w:r>
+          </w:p>
+        </w:tc>
+        <w:tc>
+          <w:tcPr>
+            <w:tcW w:w="4508" w:type="dxa"/>
+          </w:tcPr>
+          <w:p/>
+        </w:tc>
+      </w:tr>
+    </w:tbl>
     <w:p/>
     <w:p>
       <w:pPr>
         <w:pStyle w:val="NoSpacing"/>
-      </w:pPr>
+        <w:rPr>
+          <w:lang w:val="ru-RU"/>
+        </w:rPr>
+      </w:pPr>
+      <w:r>
+        <w:rPr>
+          <w:b/>
+          <w:bCs/>
+        </w:rPr>
+        <w:t xml:space="preserve">Dependencies. </w:t>
+      </w:r>
+      <w:r>
+        <w:t>Service depends on the external financial system that will handle invoicing. Also, an important part will be dependency on the accuracy of data referred to location and property and approver from organizations.</w:t>
+      </w:r>
+    </w:p>
+    <w:p>
+      <w:pPr>
+        <w:pStyle w:val="NoSpacing"/>
+        <w:rPr>
+          <w:lang w:val="ru-RU"/>
+        </w:rPr>
+      </w:pPr>
+    </w:p>
+    <w:p>
+      <w:pPr>
+        <w:pStyle w:val="NoSpacing"/>
+        <w:rPr>
+          <w:lang w:val="en-US"/>
+        </w:rPr>
+      </w:pPr>
+      <w:r>
+        <w:rPr>
+          <w:b/>
+          <w:bCs/>
+          <w:lang w:val="en-US"/>
+        </w:rPr>
+        <w:t>Assumptions and Constraints</w:t>
+      </w:r>
+      <w:r>
+        <w:rPr>
+          <w:b/>
+          <w:bCs/>
+        </w:rPr>
+        <w:t xml:space="preserve">. </w:t>
+      </w:r>
+      <w:r>
+        <w:rPr>
+          <w:lang w:val="en-US"/>
+        </w:rPr>
+        <w:t>The main constraints are the separation out of finance, and the data protection law that covers occupants and workers that are coming from the external companies.</w:t>
+      </w:r>
+    </w:p>
+    <w:p>
+      <w:pPr>
+        <w:pStyle w:val="NoSpacing"/>
+        <w:rPr>
+          <w:lang w:val="en-US"/>
+        </w:rPr>
+      </w:pPr>
+    </w:p>
+    <w:p>
+      <w:pPr>
+        <w:pStyle w:val="NoSpacing"/>
+        <w:rPr>
+          <w:lang w:val="en-US"/>
+        </w:rPr>
+      </w:pPr>
+    </w:p>
+    <w:p>
+      <w:pPr>
+        <w:pStyle w:val="Heading2"/>
+        <w:rPr>
+          <w:lang w:val="en-US"/>
+        </w:rPr>
+      </w:pPr>
+      <w:r>
+        <w:rPr>
+          <w:lang w:val="en-US"/>
+        </w:rPr>
+        <w:t>Stakeholders and Actors</w:t>
+      </w:r>
+    </w:p>
+    <w:p>
+      <w:pPr>
+        <w:pStyle w:val="Heading3"/>
+        <w:rPr>
+          <w:lang w:val="en-US"/>
+        </w:rPr>
+      </w:pPr>
+      <w:r>
+        <w:rPr>
+          <w:lang w:val="en-US"/>
+        </w:rPr>
+        <w:t>Stakeholder List</w:t>
+      </w:r>
+    </w:p>
+    <w:tbl>
+      <w:tblPr>
+        <w:tblStyle w:val="TableGrid"/>
+        <w:tblW w:w="0" w:type="auto"/>
+        <w:tblLook w:val="04A0" w:firstRow="1" w:lastRow="0" w:firstColumn="1" w:lastColumn="0" w:noHBand="0" w:noVBand="1"/>
+      </w:tblPr>
+      <w:tblGrid>
+        <w:gridCol w:w="2254"/>
+        <w:gridCol w:w="2254"/>
+        <w:gridCol w:w="2254"/>
+        <w:gridCol w:w="2254"/>
+      </w:tblGrid>
+      <w:tr>
+        <w:tc>
+          <w:tcPr>
+            <w:tcW w:w="2254" w:type="dxa"/>
+          </w:tcPr>
+          <w:p>
+            <w:pPr>
+              <w:rPr>
+                <w:lang w:val="en-US"/>
+              </w:rPr>
+            </w:pPr>
+            <w:r>
+              <w:rPr>
+                <w:lang w:val="en-US"/>
+              </w:rPr>
+              <w:t>Stakeholder</w:t>
+            </w:r>
+          </w:p>
+        </w:tc>
+        <w:tc>
+          <w:tcPr>
+            <w:tcW w:w="2254" w:type="dxa"/>
+          </w:tcPr>
+          <w:p>
+            <w:pPr>
+              <w:rPr>
+                <w:lang w:val="en-US"/>
+              </w:rPr>
+            </w:pPr>
+            <w:r>
+              <w:rPr>
+                <w:lang w:val="en-US"/>
+              </w:rPr>
+              <w:t>Goals</w:t>
+            </w:r>
+          </w:p>
+        </w:tc>
+        <w:tc>
+          <w:tcPr>
+            <w:tcW w:w="2254" w:type="dxa"/>
+          </w:tcPr>
+          <w:p>
+            <w:pPr>
+              <w:rPr>
+                <w:lang w:val="en-US"/>
+              </w:rPr>
+            </w:pPr>
+            <w:r>
+              <w:rPr>
+                <w:lang w:val="en-US"/>
+              </w:rPr>
+              <w:t>Concern</w:t>
+            </w:r>
+          </w:p>
+        </w:tc>
+        <w:tc>
+          <w:tcPr>
+            <w:tcW w:w="2254" w:type="dxa"/>
+          </w:tcPr>
+          <w:p>
+            <w:pPr>
+              <w:rPr>
+                <w:lang w:val="en-US"/>
+              </w:rPr>
+            </w:pPr>
+            <w:r>
+              <w:rPr>
+                <w:lang w:val="en-US"/>
+              </w:rPr>
+              <w:t>Influence</w:t>
+            </w:r>
+          </w:p>
+        </w:tc>
+      </w:tr>
+      <w:tr>
+        <w:tc>
+          <w:tcPr>
+            <w:tcW w:w="2254" w:type="dxa"/>
+          </w:tcPr>
+          <w:p>
+            <w:pPr>
+              <w:rPr>
+                <w:lang w:val="en-US"/>
+              </w:rPr>
+            </w:pPr>
+            <w:r>
+              <w:rPr>
+                <w:lang w:val="en-US"/>
+              </w:rPr>
+              <w:t>KCPS Management</w:t>
+            </w:r>
+          </w:p>
+        </w:tc>
+        <w:tc>
+          <w:tcPr>
+            <w:tcW w:w="2254" w:type="dxa"/>
+          </w:tcPr>
+          <w:p>
+            <w:pPr>
+              <w:rPr>
+                <w:lang w:val="en-US"/>
+              </w:rPr>
+            </w:pPr>
+            <w:r>
+              <w:rPr>
+                <w:lang w:val="en-US"/>
+              </w:rPr>
+              <w:t>Deliver consistent service</w:t>
+            </w:r>
+          </w:p>
+        </w:tc>
+        <w:tc>
+          <w:tcPr>
+            <w:tcW w:w="2254" w:type="dxa"/>
+          </w:tcPr>
+          <w:p>
+            <w:pPr>
+              <w:rPr>
+                <w:lang w:val="en-US"/>
+              </w:rPr>
+            </w:pPr>
+            <w:r>
+              <w:rPr>
+                <w:lang w:val="en-US"/>
+              </w:rPr>
+              <w:t>Reputation, cost</w:t>
+            </w:r>
+          </w:p>
+        </w:tc>
+        <w:tc>
+          <w:tcPr>
+            <w:tcW w:w="2254" w:type="dxa"/>
+          </w:tcPr>
+          <w:p>
+            <w:pPr>
+              <w:rPr>
+                <w:lang w:val="en-US"/>
+              </w:rPr>
+            </w:pPr>
+            <w:r>
+              <w:rPr>
+                <w:lang w:val="en-US"/>
+              </w:rPr>
+              <w:t>High</w:t>
+            </w:r>
+          </w:p>
+        </w:tc>
+      </w:tr>
+      <w:tr>
+        <w:tc>
+          <w:tcPr>
+            <w:tcW w:w="2254" w:type="dxa"/>
+          </w:tcPr>
+          <w:p>
+            <w:pPr>
+              <w:rPr>
+                <w:lang w:val="en-US"/>
+              </w:rPr>
+            </w:pPr>
+            <w:r>
+              <w:rPr>
+                <w:lang w:val="en-US"/>
+              </w:rPr>
+              <w:t>Occupant</w:t>
+            </w:r>
+          </w:p>
+        </w:tc>
+        <w:tc>
+          <w:tcPr>
+            <w:tcW w:w="2254" w:type="dxa"/>
+          </w:tcPr>
+          <w:p>
+            <w:pPr>
+              <w:rPr>
+                <w:lang w:val="en-US"/>
+              </w:rPr>
+            </w:pPr>
+            <w:r>
+              <w:rPr>
+                <w:lang w:val="en-US"/>
+              </w:rPr>
+              <w:t>Report problem, being informed</w:t>
+            </w:r>
+          </w:p>
+        </w:tc>
+        <w:tc>
+          <w:tcPr>
+            <w:tcW w:w="2254" w:type="dxa"/>
+          </w:tcPr>
+          <w:p>
+            <w:pPr>
+              <w:rPr>
+                <w:lang w:val="en-US"/>
+              </w:rPr>
+            </w:pPr>
+            <w:r>
+              <w:rPr>
+                <w:lang w:val="en-US"/>
+              </w:rPr>
+              <w:t>Doesn’t know the trade, privacy</w:t>
+            </w:r>
+          </w:p>
+        </w:tc>
+        <w:tc>
+          <w:tcPr>
+            <w:tcW w:w="2254" w:type="dxa"/>
+          </w:tcPr>
+          <w:p>
+            <w:pPr>
+              <w:rPr>
+                <w:lang w:val="en-US"/>
+              </w:rPr>
+            </w:pPr>
+            <w:r>
+              <w:rPr>
+                <w:lang w:val="en-US"/>
+              </w:rPr>
+              <w:t>Medium</w:t>
+            </w:r>
+          </w:p>
+        </w:tc>
+      </w:tr>
+      <w:tr>
+        <w:tc>
+          <w:tcPr>
+            <w:tcW w:w="2254" w:type="dxa"/>
+          </w:tcPr>
+          <w:p>
+            <w:pPr>
+              <w:rPr>
+                <w:lang w:val="en-US"/>
+              </w:rPr>
+            </w:pPr>
+            <w:r>
+              <w:rPr>
+                <w:lang w:val="en-US"/>
+              </w:rPr>
+              <w:t>Caretaker</w:t>
+            </w:r>
+          </w:p>
+        </w:tc>
+        <w:tc>
+          <w:tcPr>
+            <w:tcW w:w="2254" w:type="dxa"/>
+          </w:tcPr>
+          <w:p>
+            <w:pPr>
+              <w:rPr>
+                <w:lang w:val="en-US"/>
+              </w:rPr>
+            </w:pPr>
+            <w:r>
+              <w:rPr>
+                <w:lang w:val="en-US"/>
+              </w:rPr>
+              <w:t xml:space="preserve">Provide controlled environment </w:t>
+            </w:r>
+          </w:p>
+        </w:tc>
+        <w:tc>
+          <w:tcPr>
+            <w:tcW w:w="2254" w:type="dxa"/>
+          </w:tcPr>
+          <w:p>
+            <w:pPr>
+              <w:rPr>
+                <w:lang w:val="en-US"/>
+              </w:rPr>
+            </w:pPr>
+            <w:r>
+              <w:rPr>
+                <w:lang w:val="en-US"/>
+              </w:rPr>
+              <w:t>Key control, personal data</w:t>
+            </w:r>
+          </w:p>
+        </w:tc>
+        <w:tc>
+          <w:tcPr>
+            <w:tcW w:w="2254" w:type="dxa"/>
+          </w:tcPr>
+          <w:p>
+            <w:pPr>
+              <w:rPr>
+                <w:lang w:val="en-US"/>
+              </w:rPr>
+            </w:pPr>
+            <w:r>
+              <w:rPr>
+                <w:lang w:val="en-US"/>
+              </w:rPr>
+              <w:t>Medium</w:t>
+            </w:r>
+          </w:p>
+        </w:tc>
+      </w:tr>
+      <w:tr>
+        <w:tc>
+          <w:tcPr>
+            <w:tcW w:w="2254" w:type="dxa"/>
+          </w:tcPr>
+          <w:p>
+            <w:pPr>
+              <w:rPr>
+                <w:lang w:val="en-US"/>
+              </w:rPr>
+            </w:pPr>
+            <w:r>
+              <w:rPr>
+                <w:lang w:val="en-US"/>
+              </w:rPr>
+              <w:t>Technician</w:t>
+            </w:r>
+          </w:p>
+        </w:tc>
+        <w:tc>
+          <w:tcPr>
+            <w:tcW w:w="2254" w:type="dxa"/>
+          </w:tcPr>
+          <w:p>
+            <w:pPr>
+              <w:rPr>
+                <w:lang w:val="en-US"/>
+              </w:rPr>
+            </w:pPr>
+            <w:r>
+              <w:rPr>
+                <w:lang w:val="en-US"/>
+              </w:rPr>
+              <w:t>Record honest outcomes</w:t>
+            </w:r>
+          </w:p>
+        </w:tc>
+        <w:tc>
+          <w:tcPr>
+            <w:tcW w:w="2254" w:type="dxa"/>
+          </w:tcPr>
+          <w:p>
+            <w:pPr>
+              <w:rPr>
+                <w:lang w:val="en-US"/>
+              </w:rPr>
+            </w:pPr>
+            <w:r>
+              <w:rPr>
+                <w:lang w:val="en-US"/>
+              </w:rPr>
+              <w:t>“Safe for now” is not “repaired”</w:t>
+            </w:r>
+          </w:p>
+        </w:tc>
+        <w:tc>
+          <w:tcPr>
+            <w:tcW w:w="2254" w:type="dxa"/>
+          </w:tcPr>
+          <w:p>
+            <w:pPr>
+              <w:rPr>
+                <w:lang w:val="en-US"/>
+              </w:rPr>
+            </w:pPr>
+            <w:r>
+              <w:rPr>
+                <w:lang w:val="en-US"/>
+              </w:rPr>
+              <w:t>Medium</w:t>
+            </w:r>
+          </w:p>
+        </w:tc>
+      </w:tr>
+      <w:tr>
+        <w:tc>
+          <w:tcPr>
+            <w:tcW w:w="2254" w:type="dxa"/>
+          </w:tcPr>
+          <w:p>
+            <w:pPr>
+              <w:rPr>
+                <w:lang w:val="en-US"/>
+              </w:rPr>
+            </w:pPr>
+            <w:r>
+              <w:rPr>
+                <w:lang w:val="en-US"/>
+              </w:rPr>
+              <w:t>External Technician</w:t>
+            </w:r>
+          </w:p>
+        </w:tc>
+        <w:tc>
+          <w:tcPr>
+            <w:tcW w:w="2254" w:type="dxa"/>
+          </w:tcPr>
+          <w:p>
+            <w:pPr>
+              <w:rPr>
+                <w:lang w:val="en-US"/>
+              </w:rPr>
+            </w:pPr>
+            <w:r>
+              <w:rPr>
+                <w:lang w:val="en-US"/>
+              </w:rPr>
+              <w:t>Work only when approved</w:t>
+            </w:r>
+          </w:p>
+        </w:tc>
+        <w:tc>
+          <w:tcPr>
+            <w:tcW w:w="2254" w:type="dxa"/>
+          </w:tcPr>
+          <w:p>
+            <w:pPr>
+              <w:rPr>
+                <w:lang w:val="en-US"/>
+              </w:rPr>
+            </w:pPr>
+            <w:r>
+              <w:rPr>
+                <w:lang w:val="en-US"/>
+              </w:rPr>
+              <w:t>Wasted time, unpaid work</w:t>
+            </w:r>
+          </w:p>
+        </w:tc>
+        <w:tc>
+          <w:tcPr>
+            <w:tcW w:w="2254" w:type="dxa"/>
+          </w:tcPr>
+          <w:p>
+            <w:pPr>
+              <w:rPr>
+                <w:lang w:val="en-US"/>
+              </w:rPr>
+            </w:pPr>
+            <w:r>
+              <w:rPr>
+                <w:lang w:val="en-US"/>
+              </w:rPr>
+              <w:t>Medium</w:t>
+            </w:r>
+          </w:p>
+        </w:tc>
+      </w:tr>
+      <w:tr>
+        <w:tc>
+          <w:tcPr>
+            <w:tcW w:w="2254" w:type="dxa"/>
+          </w:tcPr>
+          <w:p>
+            <w:pPr>
+              <w:rPr>
+                <w:lang w:val="en-US"/>
+              </w:rPr>
+            </w:pPr>
+            <w:r>
+              <w:rPr>
+                <w:lang w:val="en-US"/>
+              </w:rPr>
+              <w:t>Maintenance Coordinator</w:t>
+            </w:r>
+          </w:p>
+        </w:tc>
+        <w:tc>
+          <w:tcPr>
+            <w:tcW w:w="2254" w:type="dxa"/>
+          </w:tcPr>
+          <w:p>
+            <w:pPr>
+              <w:rPr>
+                <w:lang w:val="en-US"/>
+              </w:rPr>
+            </w:pPr>
+            <w:r>
+              <w:rPr>
+                <w:lang w:val="en-US"/>
+              </w:rPr>
+              <w:t xml:space="preserve">Provide consistent priority </w:t>
+            </w:r>
+            <w:r>
+              <w:rPr>
+                <w:lang w:val="en-US"/>
+              </w:rPr>
+              <w:t>marks</w:t>
+            </w:r>
+            <w:r>
+              <w:rPr>
+                <w:lang w:val="en-US"/>
+              </w:rPr>
+              <w:t xml:space="preserve"> and allocation of work</w:t>
+            </w:r>
+          </w:p>
+        </w:tc>
+        <w:tc>
+          <w:tcPr>
+            <w:tcW w:w="2254" w:type="dxa"/>
+          </w:tcPr>
+          <w:p>
+            <w:pPr>
+              <w:rPr>
+                <w:lang w:val="en-US"/>
+              </w:rPr>
+            </w:pPr>
+            <w:r>
+              <w:rPr>
+                <w:lang w:val="en-US"/>
+              </w:rPr>
+              <w:t>“Urgent” means different things</w:t>
+            </w:r>
+          </w:p>
+        </w:tc>
+        <w:tc>
+          <w:tcPr>
+            <w:tcW w:w="2254" w:type="dxa"/>
+          </w:tcPr>
+          <w:p>
+            <w:pPr>
+              <w:rPr>
+                <w:lang w:val="en-US"/>
+              </w:rPr>
+            </w:pPr>
+            <w:r>
+              <w:rPr>
+                <w:lang w:val="en-US"/>
+              </w:rPr>
+              <w:t>High</w:t>
+            </w:r>
+          </w:p>
+        </w:tc>
+      </w:tr>
+      <w:tr>
+        <w:tc>
+          <w:tcPr>
+            <w:tcW w:w="2254" w:type="dxa"/>
+          </w:tcPr>
+          <w:p>
+            <w:pPr>
+              <w:rPr>
+                <w:lang w:val="en-US"/>
+              </w:rPr>
+            </w:pPr>
+            <w:r>
+              <w:rPr>
+                <w:lang w:val="en-US"/>
+              </w:rPr>
+              <w:lastRenderedPageBreak/>
+              <w:t>Property Manager</w:t>
+            </w:r>
+          </w:p>
+        </w:tc>
+        <w:tc>
+          <w:tcPr>
+            <w:tcW w:w="2254" w:type="dxa"/>
+          </w:tcPr>
+          <w:p>
+            <w:pPr>
+              <w:rPr>
+                <w:lang w:val="en-US"/>
+              </w:rPr>
+            </w:pPr>
+            <w:r>
+              <w:rPr>
+                <w:lang w:val="en-US"/>
+              </w:rPr>
+              <w:t>See open overdue, temporary and recurring work</w:t>
+            </w:r>
+          </w:p>
+        </w:tc>
+        <w:tc>
+          <w:tcPr>
+            <w:tcW w:w="2254" w:type="dxa"/>
+          </w:tcPr>
+          <w:p>
+            <w:pPr>
+              <w:rPr>
+                <w:lang w:val="en-US"/>
+              </w:rPr>
+            </w:pPr>
+            <w:r>
+              <w:rPr>
+                <w:lang w:val="en-US"/>
+              </w:rPr>
+              <w:t>Repeat faults not linked</w:t>
+            </w:r>
+          </w:p>
+        </w:tc>
+        <w:tc>
+          <w:tcPr>
+            <w:tcW w:w="2254" w:type="dxa"/>
+          </w:tcPr>
+          <w:p>
+            <w:pPr>
+              <w:rPr>
+                <w:lang w:val="en-US"/>
+              </w:rPr>
+            </w:pPr>
+            <w:r>
+              <w:rPr>
+                <w:lang w:val="en-US"/>
+              </w:rPr>
+              <w:t>High</w:t>
+            </w:r>
+          </w:p>
+        </w:tc>
+      </w:tr>
+      <w:tr>
+        <w:tc>
+          <w:tcPr>
+            <w:tcW w:w="2254" w:type="dxa"/>
+          </w:tcPr>
+          <w:p>
+            <w:pPr>
+              <w:rPr>
+                <w:lang w:val="en-US"/>
+              </w:rPr>
+            </w:pPr>
+            <w:r>
+              <w:rPr>
+                <w:lang w:val="en-US"/>
+              </w:rPr>
+              <w:t>Responsible Organization</w:t>
+            </w:r>
+          </w:p>
+        </w:tc>
+        <w:tc>
+          <w:tcPr>
+            <w:tcW w:w="2254" w:type="dxa"/>
+          </w:tcPr>
+          <w:p>
+            <w:pPr>
+              <w:rPr>
+                <w:lang w:val="en-US"/>
+              </w:rPr>
+            </w:pPr>
+            <w:r>
+              <w:rPr>
+                <w:lang w:val="en-US"/>
+              </w:rPr>
+              <w:t>Approve and pay for its own work</w:t>
+            </w:r>
+          </w:p>
+        </w:tc>
+        <w:tc>
+          <w:tcPr>
+            <w:tcW w:w="2254" w:type="dxa"/>
+          </w:tcPr>
+          <w:p>
+            <w:pPr>
+              <w:rPr>
+                <w:lang w:val="en-US"/>
+              </w:rPr>
+            </w:pPr>
+            <w:r>
+              <w:rPr>
+                <w:lang w:val="en-US"/>
+              </w:rPr>
+              <w:t>Unclear liability</w:t>
+            </w:r>
+          </w:p>
+        </w:tc>
+        <w:tc>
+          <w:tcPr>
+            <w:tcW w:w="2254" w:type="dxa"/>
+          </w:tcPr>
+          <w:p>
+            <w:pPr>
+              <w:rPr>
+                <w:lang w:val="en-US"/>
+              </w:rPr>
+            </w:pPr>
+            <w:r>
+              <w:rPr>
+                <w:lang w:val="en-US"/>
+              </w:rPr>
+              <w:t>High</w:t>
+            </w:r>
+          </w:p>
+        </w:tc>
+      </w:tr>
+      <w:tr>
+        <w:tc>
+          <w:tcPr>
+            <w:tcW w:w="2254" w:type="dxa"/>
+          </w:tcPr>
+          <w:p>
+            <w:pPr>
+              <w:rPr>
+                <w:lang w:val="en-US"/>
+              </w:rPr>
+            </w:pPr>
+            <w:r>
+              <w:rPr>
+                <w:lang w:val="en-US"/>
+              </w:rPr>
+              <w:t>Finance System</w:t>
+            </w:r>
+          </w:p>
+        </w:tc>
+        <w:tc>
+          <w:tcPr>
+            <w:tcW w:w="2254" w:type="dxa"/>
+          </w:tcPr>
+          <w:p>
+            <w:pPr>
+              <w:rPr>
+                <w:lang w:val="en-US"/>
+              </w:rPr>
+            </w:pPr>
+            <w:r>
+              <w:rPr>
+                <w:lang w:val="en-US"/>
+              </w:rPr>
+              <w:t>Receive approved work, produce invoices</w:t>
+            </w:r>
+          </w:p>
+        </w:tc>
+        <w:tc>
+          <w:tcPr>
+            <w:tcW w:w="2254" w:type="dxa"/>
+          </w:tcPr>
+          <w:p>
+            <w:pPr>
+              <w:rPr>
+                <w:lang w:val="en-US"/>
+              </w:rPr>
+            </w:pPr>
+            <w:r>
+              <w:rPr>
+                <w:lang w:val="en-US"/>
+              </w:rPr>
+              <w:t>Duplicated or unapproved charges</w:t>
+            </w:r>
+          </w:p>
+        </w:tc>
+        <w:tc>
+          <w:tcPr>
+            <w:tcW w:w="2254" w:type="dxa"/>
+          </w:tcPr>
+          <w:p>
+            <w:pPr>
+              <w:rPr>
+                <w:lang w:val="en-US"/>
+              </w:rPr>
+            </w:pPr>
+            <w:r>
+              <w:rPr>
+                <w:lang w:val="en-US"/>
+              </w:rPr>
+              <w:t>High</w:t>
+            </w:r>
+          </w:p>
+        </w:tc>
+      </w:tr>
+    </w:tbl>
+    <w:p>
+      <w:pPr>
+        <w:rPr>
+          <w:lang w:val="en-US"/>
+        </w:rPr>
+      </w:pPr>
+    </w:p>
+    <w:p>
+      <w:pPr>
+        <w:rPr>
+          <w:lang w:val="en-US"/>
+        </w:rPr>
+      </w:pPr>
+      <w:r>
+        <w:rPr>
+          <w:b/>
+          <w:bCs/>
+          <w:lang w:val="en-US"/>
+        </w:rPr>
+        <w:t>Observations.</w:t>
+      </w:r>
+      <w:r>
+        <w:rPr>
+          <w:b/>
+          <w:bCs/>
+          <w:lang w:val="en-US"/>
+        </w:rPr>
+        <w:t xml:space="preserve"> </w:t>
+      </w:r>
+    </w:p>
+    <w:p>
+      <w:pPr>
+        <w:pStyle w:val="ListParagraph"/>
+        <w:numPr>
+          <w:ilvl w:val="0"/>
+          <w:numId w:val="2"/>
+        </w:numPr>
+        <w:rPr>
+          <w:lang w:val="en-US"/>
+        </w:rPr>
+      </w:pPr>
+      <w:r>
+        <w:rPr>
+          <w:lang w:val="en-US"/>
+        </w:rPr>
+        <w:t>Not every stakeholder is a daily user.</w:t>
+      </w:r>
+    </w:p>
+    <w:p>
+      <w:pPr>
+        <w:pStyle w:val="ListParagraph"/>
+        <w:numPr>
+          <w:ilvl w:val="0"/>
+          <w:numId w:val="2"/>
+        </w:numPr>
+        <w:rPr>
+          <w:lang w:val="en-US"/>
+        </w:rPr>
+      </w:pPr>
+      <w:r>
+        <w:rPr>
+          <w:lang w:val="en-US"/>
+        </w:rPr>
+        <w:t>Stakeholders’ goals can conflict. Contractors want certainty, while coordinators speed</w:t>
+      </w:r>
+    </w:p>
+    <w:p>
+      <w:pPr>
+        <w:rPr>
+          <w:lang w:val="en-US"/>
+        </w:rPr>
+      </w:pPr>
+    </w:p>
+    <w:p>
+      <w:pPr>
+        <w:pStyle w:val="Heading3"/>
+        <w:rPr>
+          <w:lang w:val="en-US"/>
+        </w:rPr>
+      </w:pPr>
+      <w:r>
+        <w:rPr>
+          <w:lang w:val="en-US"/>
+        </w:rPr>
+        <w:t>Actors</w:t>
+      </w:r>
     </w:p>
     <w:sectPr>
       <w:pgSz w:w="11906" w:h="16838"/>
@@ -683,6 +1591,241 @@
 </w:document>
 </file>
 
+<file path=word/numbering.xml><?xml version="1.0" encoding="utf-8"?>
+<w:numbering xmlns:wpc="http://schemas.microsoft.com/office/word/2010/wordprocessingCanvas" xmlns:cx="http://schemas.microsoft.com/office/drawing/2014/chartex" xmlns:cx1="http://schemas.microsoft.com/office/drawing/2015/9/8/chartex" xmlns:cx2="http://schemas.microsoft.com/office/drawing/2015/10/21/chartex" xmlns:cx3="http://schemas.microsoft.com/office/drawing/2016/5/9/chartex" xmlns:cx4="http://schemas.microsoft.com/office/drawing/2016/5/10/chartex" xmlns:cx5="http://schemas.microsoft.com/office/drawing/2016/5/11/chartex" xmlns:cx6="http://schemas.microsoft.com/office/drawing/2016/5/12/chartex" xmlns:cx7="http://schemas.microsoft.com/office/drawing/2016/5/13/chartex" xmlns:cx8="http://schemas.microsoft.com/office/drawing/2016/5/14/chartex" xmlns:mc="http://schemas.openxmlformats.org/markup-compatibility/2006" xmlns:aink="http://schemas.microsoft.com/office/drawing/2016/ink" xmlns:am3d="http://schemas.microsoft.com/office/drawing/2017/model3d" xmlns:o="urn:schemas-microsoft-com:office:office" xmlns:oel="http://schemas.microsoft.com/office/2019/extlst" xmlns:r="http://schemas.openxmlformats.org/officeDocument/2006/relationships" xmlns:m="http://schemas.openxmlformats.org/officeDocument/2006/math" xmlns:v="urn:schemas-microsoft-com:vml" xmlns:wp14="http://schemas.microsoft.com/office/word/2010/wordprocessingDrawing" xmlns:wp="http://schemas.openxmlformats.org/drawingml/2006/wordprocessingDrawing" xmlns:w10="urn:schemas-microsoft-com:office:word" xmlns:w="http://schemas.openxmlformats.org/wordprocessingml/2006/main" xmlns:w14="http://schemas.microsoft.com/office/word/2010/wordml" xmlns:w15="http://schemas.microsoft.com/office/word/2012/wordml" xmlns:w16cex="http://schemas.microsoft.com/office/word/2018/wordml/cex" xmlns:w16cid="http://schemas.microsoft.com/office/word/2016/wordml/cid" xmlns:w16="http://schemas.microsoft.com/office/word/2018/wordml" xmlns:w16du="http://schemas.microsoft.com/office/word/2023/wordml/word16du" xmlns:w16sdtdh="http://schemas.microsoft.com/office/word/2020/wordml/sdtdatahash" xmlns:w16sdtfl="http://schemas.microsoft.com/office/word/2024/wordml/sdtformatlock" xmlns:w16se="http://schemas.microsoft.com/office/word/2015/wordml/symex" xmlns:wpg="http://schemas.microsoft.com/office/word/2010/wordprocessingGroup" xmlns:wpi="http://schemas.microsoft.com/office/word/2010/wordprocessingInk" xmlns:wne="http://schemas.microsoft.com/office/word/2006/wordml" xmlns:wps="http://schemas.microsoft.com/office/word/2010/wordprocessingShape" mc:Ignorable="w14 w15 w16se w16cid w16 w16cex w16sdtdh w16sdtfl w16du wp14">
+  <w:abstractNum w:abstractNumId="0" w15:restartNumberingAfterBreak="0">
+    <w:nsid w:val="5D7A6293"/>
+    <w:multiLevelType w:val="hybridMultilevel"/>
+    <w:tmpl w:val="C3DC6C7C"/>
+    <w:lvl w:ilvl="0" w:tplc="AE22D3E0">
+      <w:numFmt w:val="bullet"/>
+      <w:lvlText w:val="-"/>
+      <w:lvlJc w:val="left"/>
+      <w:pPr>
+        <w:ind w:left="720" w:hanging="360"/>
+      </w:pPr>
+      <w:rPr>
+        <w:rFonts w:ascii="Aptos" w:eastAsiaTheme="minorHAnsi" w:hAnsi="Aptos" w:cstheme="minorBidi" w:hint="default"/>
+      </w:rPr>
+    </w:lvl>
+    <w:lvl w:ilvl="1" w:tplc="18090003" w:tentative="1">
+      <w:start w:val="1"/>
+      <w:numFmt w:val="bullet"/>
+      <w:lvlText w:val="o"/>
+      <w:lvlJc w:val="left"/>
+      <w:pPr>
+        <w:ind w:left="1440" w:hanging="360"/>
+      </w:pPr>
+      <w:rPr>
+        <w:rFonts w:ascii="Courier New" w:hAnsi="Courier New" w:cs="Courier New" w:hint="default"/>
+      </w:rPr>
+    </w:lvl>
+    <w:lvl w:ilvl="2" w:tplc="18090005" w:tentative="1">
+      <w:start w:val="1"/>
+      <w:numFmt w:val="bullet"/>
+      <w:lvlText w:val=""/>
+      <w:lvlJc w:val="left"/>
+      <w:pPr>
+        <w:ind w:left="2160" w:hanging="360"/>
+      </w:pPr>
+      <w:rPr>
+        <w:rFonts w:ascii="Wingdings" w:hAnsi="Wingdings" w:hint="default"/>
+      </w:rPr>
+    </w:lvl>
+    <w:lvl w:ilvl="3" w:tplc="18090001" w:tentative="1">
+      <w:start w:val="1"/>
+      <w:numFmt w:val="bullet"/>
+      <w:lvlText w:val=""/>
+      <w:lvlJc w:val="left"/>
+      <w:pPr>
+        <w:ind w:left="2880" w:hanging="360"/>
+      </w:pPr>
+      <w:rPr>
+        <w:rFonts w:ascii="Symbol" w:hAnsi="Symbol" w:hint="default"/>
+      </w:rPr>
+    </w:lvl>
+    <w:lvl w:ilvl="4" w:tplc="18090003" w:tentative="1">
+      <w:start w:val="1"/>
+      <w:numFmt w:val="bullet"/>
+      <w:lvlText w:val="o"/>
+      <w:lvlJc w:val="left"/>
+      <w:pPr>
+        <w:ind w:left="3600" w:hanging="360"/>
+      </w:pPr>
+      <w:rPr>
+        <w:rFonts w:ascii="Courier New" w:hAnsi="Courier New" w:cs="Courier New" w:hint="default"/>
+      </w:rPr>
+    </w:lvl>
+    <w:lvl w:ilvl="5" w:tplc="18090005" w:tentative="1">
+      <w:start w:val="1"/>
+      <w:numFmt w:val="bullet"/>
+      <w:lvlText w:val=""/>
+      <w:lvlJc w:val="left"/>
+      <w:pPr>
+        <w:ind w:left="4320" w:hanging="360"/>
+      </w:pPr>
+      <w:rPr>
+        <w:rFonts w:ascii="Wingdings" w:hAnsi="Wingdings" w:hint="default"/>
+      </w:rPr>
+    </w:lvl>
+    <w:lvl w:ilvl="6" w:tplc="18090001" w:tentative="1">
+      <w:start w:val="1"/>
+      <w:numFmt w:val="bullet"/>
+      <w:lvlText w:val=""/>
+      <w:lvlJc w:val="left"/>
+      <w:pPr>
+        <w:ind w:left="5040" w:hanging="360"/>
+      </w:pPr>
+      <w:rPr>
+        <w:rFonts w:ascii="Symbol" w:hAnsi="Symbol" w:hint="default"/>
+      </w:rPr>
+    </w:lvl>
+    <w:lvl w:ilvl="7" w:tplc="18090003" w:tentative="1">
+      <w:start w:val="1"/>
+      <w:numFmt w:val="bullet"/>
+      <w:lvlText w:val="o"/>
+      <w:lvlJc w:val="left"/>
+      <w:pPr>
+        <w:ind w:left="5760" w:hanging="360"/>
+      </w:pPr>
+      <w:rPr>
+        <w:rFonts w:ascii="Courier New" w:hAnsi="Courier New" w:cs="Courier New" w:hint="default"/>
+      </w:rPr>
+    </w:lvl>
+    <w:lvl w:ilvl="8" w:tplc="18090005" w:tentative="1">
+      <w:start w:val="1"/>
+      <w:numFmt w:val="bullet"/>
+      <w:lvlText w:val=""/>
+      <w:lvlJc w:val="left"/>
+      <w:pPr>
+        <w:ind w:left="6480" w:hanging="360"/>
+      </w:pPr>
+      <w:rPr>
+        <w:rFonts w:ascii="Wingdings" w:hAnsi="Wingdings" w:hint="default"/>
+      </w:rPr>
+    </w:lvl>
+  </w:abstractNum>
+  <w:abstractNum w:abstractNumId="1" w15:restartNumberingAfterBreak="0">
+    <w:nsid w:val="64304D7B"/>
+    <w:multiLevelType w:val="hybridMultilevel"/>
+    <w:tmpl w:val="A986FB3A"/>
+    <w:lvl w:ilvl="0" w:tplc="2E804FE6">
+      <w:numFmt w:val="bullet"/>
+      <w:lvlText w:val="-"/>
+      <w:lvlJc w:val="left"/>
+      <w:pPr>
+        <w:ind w:left="720" w:hanging="360"/>
+      </w:pPr>
+      <w:rPr>
+        <w:rFonts w:ascii="Aptos" w:eastAsiaTheme="minorHAnsi" w:hAnsi="Aptos" w:cstheme="minorBidi" w:hint="default"/>
+      </w:rPr>
+    </w:lvl>
+    <w:lvl w:ilvl="1" w:tplc="18090003" w:tentative="1">
+      <w:start w:val="1"/>
+      <w:numFmt w:val="bullet"/>
+      <w:lvlText w:val="o"/>
+      <w:lvlJc w:val="left"/>
+      <w:pPr>
+        <w:ind w:left="1440" w:hanging="360"/>
+      </w:pPr>
+      <w:rPr>
+        <w:rFonts w:ascii="Courier New" w:hAnsi="Courier New" w:cs="Courier New" w:hint="default"/>
+      </w:rPr>
+    </w:lvl>
+    <w:lvl w:ilvl="2" w:tplc="18090005" w:tentative="1">
+      <w:start w:val="1"/>
+      <w:numFmt w:val="bullet"/>
+      <w:lvlText w:val=""/>
+      <w:lvlJc w:val="left"/>
+      <w:pPr>
+        <w:ind w:left="2160" w:hanging="360"/>
+      </w:pPr>
+      <w:rPr>
+        <w:rFonts w:ascii="Wingdings" w:hAnsi="Wingdings" w:hint="default"/>
+      </w:rPr>
+    </w:lvl>
+    <w:lvl w:ilvl="3" w:tplc="18090001" w:tentative="1">
+      <w:start w:val="1"/>
+      <w:numFmt w:val="bullet"/>
+      <w:lvlText w:val=""/>
+      <w:lvlJc w:val="left"/>
+      <w:pPr>
+        <w:ind w:left="2880" w:hanging="360"/>
+      </w:pPr>
+      <w:rPr>
+        <w:rFonts w:ascii="Symbol" w:hAnsi="Symbol" w:hint="default"/>
+      </w:rPr>
+    </w:lvl>
+    <w:lvl w:ilvl="4" w:tplc="18090003" w:tentative="1">
+      <w:start w:val="1"/>
+      <w:numFmt w:val="bullet"/>
+      <w:lvlText w:val="o"/>
+      <w:lvlJc w:val="left"/>
+      <w:pPr>
+        <w:ind w:left="3600" w:hanging="360"/>
+      </w:pPr>
+      <w:rPr>
+        <w:rFonts w:ascii="Courier New" w:hAnsi="Courier New" w:cs="Courier New" w:hint="default"/>
+      </w:rPr>
+    </w:lvl>
+    <w:lvl w:ilvl="5" w:tplc="18090005" w:tentative="1">
+      <w:start w:val="1"/>
+      <w:numFmt w:val="bullet"/>
+      <w:lvlText w:val=""/>
+      <w:lvlJc w:val="left"/>
+      <w:pPr>
+        <w:ind w:left="4320" w:hanging="360"/>
+      </w:pPr>
+      <w:rPr>
+        <w:rFonts w:ascii="Wingdings" w:hAnsi="Wingdings" w:hint="default"/>
+      </w:rPr>
+    </w:lvl>
+    <w:lvl w:ilvl="6" w:tplc="18090001" w:tentative="1">
+      <w:start w:val="1"/>
+      <w:numFmt w:val="bullet"/>
+      <w:lvlText w:val=""/>
+      <w:lvlJc w:val="left"/>
+      <w:pPr>
+        <w:ind w:left="5040" w:hanging="360"/>
+      </w:pPr>
+      <w:rPr>
+        <w:rFonts w:ascii="Symbol" w:hAnsi="Symbol" w:hint="default"/>
+      </w:rPr>
+    </w:lvl>
+    <w:lvl w:ilvl="7" w:tplc="18090003" w:tentative="1">
+      <w:start w:val="1"/>
+      <w:numFmt w:val="bullet"/>
+      <w:lvlText w:val="o"/>
+      <w:lvlJc w:val="left"/>
+      <w:pPr>
+        <w:ind w:left="5760" w:hanging="360"/>
+      </w:pPr>
+      <w:rPr>
+        <w:rFonts w:ascii="Courier New" w:hAnsi="Courier New" w:cs="Courier New" w:hint="default"/>
+      </w:rPr>
+    </w:lvl>
+    <w:lvl w:ilvl="8" w:tplc="18090005" w:tentative="1">
+      <w:start w:val="1"/>
+      <w:numFmt w:val="bullet"/>
+      <w:lvlText w:val=""/>
+      <w:lvlJc w:val="left"/>
+      <w:pPr>
+        <w:ind w:left="6480" w:hanging="360"/>
+      </w:pPr>
+      <w:rPr>
+        <w:rFonts w:ascii="Wingdings" w:hAnsi="Wingdings" w:hint="default"/>
+      </w:rPr>
+    </w:lvl>
+  </w:abstractNum>
+  <w:num w:numId="1" w16cid:durableId="364913152">
+    <w:abstractNumId w:val="1"/>
+  </w:num>
+  <w:num w:numId="2" w16cid:durableId="313682462">
+    <w:abstractNumId w:val="0"/>
+  </w:num>
+</w:numbering>
+</file>
+
 <file path=word/styles.xml><?xml version="1.0" encoding="utf-8"?>
 <w:styles xmlns:mc="http://schemas.openxmlformats.org/markup-compatibility/2006" xmlns:r="http://schemas.openxmlformats.org/officeDocument/2006/relationships" xmlns:w="http://schemas.openxmlformats.org/wordprocessingml/2006/main" xmlns:w14="http://schemas.microsoft.com/office/word/2010/wordml" xmlns:w15="http://schemas.microsoft.com/office/word/2012/wordml" xmlns:w16cex="http://schemas.microsoft.com/office/word/2018/wordml/cex" xmlns:w16cid="http://schemas.microsoft.com/office/word/2016/wordml/cid" xmlns:w16="http://schemas.microsoft.com/office/word/2018/wordml" xmlns:w16du="http://schemas.microsoft.com/office/word/2023/wordml/word16du" xmlns:w16sdtdh="http://schemas.microsoft.com/office/word/2020/wordml/sdtdatahash" xmlns:w16sdtfl="http://schemas.microsoft.com/office/word/2024/wordml/sdtformatlock" xmlns:w16se="http://schemas.microsoft.com/office/word/2015/wordml/symex" mc:Ignorable="w14 w15 w16se w16cid w16 w16cex w16sdtdh w16sdtfl w16du">
   <w:docDefaults>
@@ -690,8 +1833,8 @@
       <w:rPr>
         <w:rFonts w:asciiTheme="minorHAnsi" w:eastAsiaTheme="minorHAnsi" w:hAnsiTheme="minorHAnsi" w:cstheme="minorBidi"/>
         <w:kern w:val="2"/>
-        <w:sz w:val="24"/>
-        <w:szCs w:val="24"/>
+        <w:sz w:val="22"/>
+        <w:szCs w:val="22"/>
         <w:lang w:val="en-IE" w:eastAsia="en-US" w:bidi="ar-SA"/>
         <w14:ligatures w14:val="standardContextual"/>
       </w:rPr>
@@ -1133,7 +2276,6 @@
     <w:next w:val="Normal"/>
     <w:link w:val="Heading3Char"/>
     <w:uiPriority w:val="9"/>
-    <w:semiHidden/>
     <w:unhideWhenUsed/>
     <w:qFormat/>
     <w:rsid w:val="006F29A7"/>
@@ -1285,6 +2427,7 @@
   <w:style w:type="character" w:default="1" w:styleId="DefaultParagraphFont">
     <w:name w:val="Default Paragraph Font"/>
     <w:uiPriority w:val="1"/>
+    <w:semiHidden/>
     <w:unhideWhenUsed/>
   </w:style>
   <w:style w:type="table" w:default="1" w:styleId="TableNormal">
@@ -1339,7 +2482,6 @@
     <w:basedOn w:val="DefaultParagraphFont"/>
     <w:link w:val="Heading3"/>
     <w:uiPriority w:val="9"/>
-    <w:semiHidden/>
     <w:rsid w:val="006F29A7"/>
     <w:rPr>
       <w:rFonts w:eastAsiaTheme="majorEastAsia" w:cstheme="majorBidi"/>

</xml_diff>

<commit_message>
Functional requirements + non-functional requirements + MoSCoW priority
</commit_message>
<xml_diff>
--- a/report/CA1.docx
+++ b/report/CA1.docx
@@ -632,9 +632,6 @@
     <w:p>
       <w:pPr>
         <w:pStyle w:val="NoSpacing"/>
-        <w:rPr>
-          <w:lang w:val="ru-RU"/>
-        </w:rPr>
       </w:pPr>
       <w:r>
         <w:rPr>
@@ -650,9 +647,6 @@
     <w:p>
       <w:pPr>
         <w:pStyle w:val="NoSpacing"/>
-        <w:rPr>
-          <w:lang w:val="ru-RU"/>
-        </w:rPr>
       </w:pPr>
     </w:p>
     <w:p>
@@ -1580,6 +1574,2129 @@
         </w:rPr>
         <w:t>Actors</w:t>
       </w:r>
+    </w:p>
+    <w:tbl>
+      <w:tblPr>
+        <w:tblStyle w:val="TableGrid"/>
+        <w:tblW w:w="0" w:type="auto"/>
+        <w:tblLook w:val="04A0" w:firstRow="1" w:lastRow="0" w:firstColumn="1" w:lastColumn="0" w:noHBand="0" w:noVBand="1"/>
+      </w:tblPr>
+      <w:tblGrid>
+        <w:gridCol w:w="3005"/>
+        <w:gridCol w:w="3005"/>
+        <w:gridCol w:w="3006"/>
+      </w:tblGrid>
+      <w:tr>
+        <w:tc>
+          <w:tcPr>
+            <w:tcW w:w="3005" w:type="dxa"/>
+          </w:tcPr>
+          <w:p>
+            <w:pPr>
+              <w:rPr>
+                <w:lang w:val="en-US"/>
+              </w:rPr>
+            </w:pPr>
+            <w:r>
+              <w:rPr>
+                <w:lang w:val="en-US"/>
+              </w:rPr>
+              <w:t>Reporter (occupant, caretaker)</w:t>
+            </w:r>
+          </w:p>
+        </w:tc>
+        <w:tc>
+          <w:tcPr>
+            <w:tcW w:w="3005" w:type="dxa"/>
+          </w:tcPr>
+          <w:p>
+            <w:pPr>
+              <w:rPr>
+                <w:lang w:val="en-US"/>
+              </w:rPr>
+            </w:pPr>
+            <w:r>
+              <w:rPr>
+                <w:lang w:val="en-US"/>
+              </w:rPr>
+              <w:t>Primary Actor</w:t>
+            </w:r>
+          </w:p>
+        </w:tc>
+        <w:tc>
+          <w:tcPr>
+            <w:tcW w:w="3006" w:type="dxa"/>
+          </w:tcPr>
+          <w:p>
+            <w:pPr>
+              <w:rPr>
+                <w:lang w:val="en-US"/>
+              </w:rPr>
+            </w:pPr>
+            <w:r>
+              <w:rPr>
+                <w:lang w:val="en-US"/>
+              </w:rPr>
+              <w:t>Looking for a problem and record it</w:t>
+            </w:r>
+          </w:p>
+        </w:tc>
+      </w:tr>
+      <w:tr>
+        <w:tc>
+          <w:tcPr>
+            <w:tcW w:w="3005" w:type="dxa"/>
+          </w:tcPr>
+          <w:p>
+            <w:pPr>
+              <w:rPr>
+                <w:lang w:val="en-US"/>
+              </w:rPr>
+            </w:pPr>
+            <w:r>
+              <w:rPr>
+                <w:lang w:val="en-US"/>
+              </w:rPr>
+              <w:t>Maintenance Coordinator</w:t>
+            </w:r>
+          </w:p>
+        </w:tc>
+        <w:tc>
+          <w:tcPr>
+            <w:tcW w:w="3005" w:type="dxa"/>
+          </w:tcPr>
+          <w:p>
+            <w:pPr>
+              <w:rPr>
+                <w:lang w:val="en-US"/>
+              </w:rPr>
+            </w:pPr>
+            <w:r>
+              <w:rPr>
+                <w:lang w:val="en-US"/>
+              </w:rPr>
+              <w:t>Primary Actor</w:t>
+            </w:r>
+          </w:p>
+        </w:tc>
+        <w:tc>
+          <w:tcPr>
+            <w:tcW w:w="3006" w:type="dxa"/>
+          </w:tcPr>
+          <w:p>
+            <w:pPr>
+              <w:rPr>
+                <w:lang w:val="en-US"/>
+              </w:rPr>
+            </w:pPr>
+            <w:r>
+              <w:rPr>
+                <w:lang w:val="en-US"/>
+              </w:rPr>
+              <w:t>Evaluation of priority, allocation of contractors, access and confirmation goals</w:t>
+            </w:r>
+          </w:p>
+        </w:tc>
+      </w:tr>
+      <w:tr>
+        <w:tc>
+          <w:tcPr>
+            <w:tcW w:w="3005" w:type="dxa"/>
+          </w:tcPr>
+          <w:p>
+            <w:pPr>
+              <w:rPr>
+                <w:lang w:val="en-US"/>
+              </w:rPr>
+            </w:pPr>
+            <w:r>
+              <w:rPr>
+                <w:lang w:val="en-US"/>
+              </w:rPr>
+              <w:t>Contractor (technician, external contractor)</w:t>
+            </w:r>
+          </w:p>
+        </w:tc>
+        <w:tc>
+          <w:tcPr>
+            <w:tcW w:w="3005" w:type="dxa"/>
+          </w:tcPr>
+          <w:p>
+            <w:pPr>
+              <w:rPr>
+                <w:lang w:val="en-US"/>
+              </w:rPr>
+            </w:pPr>
+            <w:r>
+              <w:rPr>
+                <w:lang w:val="en-US"/>
+              </w:rPr>
+              <w:t>Primary actor</w:t>
+            </w:r>
+          </w:p>
+        </w:tc>
+        <w:tc>
+          <w:tcPr>
+            <w:tcW w:w="3006" w:type="dxa"/>
+          </w:tcPr>
+          <w:p>
+            <w:pPr>
+              <w:rPr>
+                <w:lang w:val="en-US"/>
+              </w:rPr>
+            </w:pPr>
+            <w:r>
+              <w:rPr>
+                <w:lang w:val="en-US"/>
+              </w:rPr>
+              <w:t>Record the outcomes of visit</w:t>
+            </w:r>
+          </w:p>
+        </w:tc>
+      </w:tr>
+      <w:tr>
+        <w:tc>
+          <w:tcPr>
+            <w:tcW w:w="3005" w:type="dxa"/>
+          </w:tcPr>
+          <w:p>
+            <w:pPr>
+              <w:rPr>
+                <w:lang w:val="en-US"/>
+              </w:rPr>
+            </w:pPr>
+            <w:r>
+              <w:rPr>
+                <w:lang w:val="en-US"/>
+              </w:rPr>
+              <w:t>Approver (responsible organization)</w:t>
+            </w:r>
+          </w:p>
+        </w:tc>
+        <w:tc>
+          <w:tcPr>
+            <w:tcW w:w="3005" w:type="dxa"/>
+          </w:tcPr>
+          <w:p>
+            <w:pPr>
+              <w:rPr>
+                <w:lang w:val="en-US"/>
+              </w:rPr>
+            </w:pPr>
+            <w:r>
+              <w:rPr>
+                <w:lang w:val="en-US"/>
+              </w:rPr>
+              <w:t>Primary actor</w:t>
+            </w:r>
+          </w:p>
+        </w:tc>
+        <w:tc>
+          <w:tcPr>
+            <w:tcW w:w="3006" w:type="dxa"/>
+          </w:tcPr>
+          <w:p>
+            <w:pPr>
+              <w:rPr>
+                <w:lang w:val="en-US"/>
+              </w:rPr>
+            </w:pPr>
+            <w:r>
+              <w:rPr>
+                <w:lang w:val="en-US"/>
+              </w:rPr>
+              <w:t>The problem was solved and paid only for required work</w:t>
+            </w:r>
+          </w:p>
+        </w:tc>
+      </w:tr>
+      <w:tr>
+        <w:tc>
+          <w:tcPr>
+            <w:tcW w:w="3005" w:type="dxa"/>
+          </w:tcPr>
+          <w:p>
+            <w:pPr>
+              <w:rPr>
+                <w:lang w:val="en-US"/>
+              </w:rPr>
+            </w:pPr>
+            <w:r>
+              <w:rPr>
+                <w:lang w:val="en-US"/>
+              </w:rPr>
+              <w:t>Property Manager</w:t>
+            </w:r>
+          </w:p>
+        </w:tc>
+        <w:tc>
+          <w:tcPr>
+            <w:tcW w:w="3005" w:type="dxa"/>
+          </w:tcPr>
+          <w:p>
+            <w:pPr>
+              <w:rPr>
+                <w:lang w:val="en-US"/>
+              </w:rPr>
+            </w:pPr>
+            <w:r>
+              <w:rPr>
+                <w:lang w:val="en-US"/>
+              </w:rPr>
+              <w:t>Primary actor</w:t>
+            </w:r>
+          </w:p>
+        </w:tc>
+        <w:tc>
+          <w:tcPr>
+            <w:tcW w:w="3006" w:type="dxa"/>
+          </w:tcPr>
+          <w:p>
+            <w:pPr>
+              <w:rPr>
+                <w:lang w:val="en-US"/>
+              </w:rPr>
+            </w:pPr>
+            <w:r>
+              <w:rPr>
+                <w:lang w:val="en-US"/>
+              </w:rPr>
+              <w:t>Seeking oversight information, approving work</w:t>
+            </w:r>
+          </w:p>
+        </w:tc>
+      </w:tr>
+      <w:tr>
+        <w:tc>
+          <w:tcPr>
+            <w:tcW w:w="3005" w:type="dxa"/>
+          </w:tcPr>
+          <w:p>
+            <w:pPr>
+              <w:rPr>
+                <w:lang w:val="en-US"/>
+              </w:rPr>
+            </w:pPr>
+            <w:r>
+              <w:rPr>
+                <w:lang w:val="en-US"/>
+              </w:rPr>
+              <w:t>Caretaker</w:t>
+            </w:r>
+          </w:p>
+        </w:tc>
+        <w:tc>
+          <w:tcPr>
+            <w:tcW w:w="3005" w:type="dxa"/>
+          </w:tcPr>
+          <w:p>
+            <w:pPr>
+              <w:rPr>
+                <w:lang w:val="en-US"/>
+              </w:rPr>
+            </w:pPr>
+            <w:r>
+              <w:rPr>
+                <w:lang w:val="en-US"/>
+              </w:rPr>
+              <w:t>Supporting actor</w:t>
+            </w:r>
+          </w:p>
+        </w:tc>
+        <w:tc>
+          <w:tcPr>
+            <w:tcW w:w="3006" w:type="dxa"/>
+          </w:tcPr>
+          <w:p>
+            <w:pPr>
+              <w:rPr>
+                <w:lang w:val="en-US"/>
+              </w:rPr>
+            </w:pPr>
+            <w:r>
+              <w:rPr>
+                <w:lang w:val="en-US"/>
+              </w:rPr>
+              <w:t>Provides key and controlled access</w:t>
+            </w:r>
+          </w:p>
+        </w:tc>
+      </w:tr>
+      <w:tr>
+        <w:tc>
+          <w:tcPr>
+            <w:tcW w:w="3005" w:type="dxa"/>
+          </w:tcPr>
+          <w:p>
+            <w:pPr>
+              <w:rPr>
+                <w:lang w:val="en-US"/>
+              </w:rPr>
+            </w:pPr>
+            <w:r>
+              <w:rPr>
+                <w:lang w:val="en-US"/>
+              </w:rPr>
+              <w:t>Occupant</w:t>
+            </w:r>
+          </w:p>
+        </w:tc>
+        <w:tc>
+          <w:tcPr>
+            <w:tcW w:w="3005" w:type="dxa"/>
+          </w:tcPr>
+          <w:p>
+            <w:pPr>
+              <w:rPr>
+                <w:lang w:val="en-US"/>
+              </w:rPr>
+            </w:pPr>
+            <w:r>
+              <w:rPr>
+                <w:lang w:val="en-US"/>
+              </w:rPr>
+              <w:t>Supporting actor</w:t>
+            </w:r>
+          </w:p>
+        </w:tc>
+        <w:tc>
+          <w:tcPr>
+            <w:tcW w:w="3006" w:type="dxa"/>
+          </w:tcPr>
+          <w:p>
+            <w:pPr>
+              <w:rPr>
+                <w:lang w:val="en-US"/>
+              </w:rPr>
+            </w:pPr>
+            <w:r>
+              <w:rPr>
+                <w:lang w:val="en-US"/>
+              </w:rPr>
+              <w:t>Confirms completion</w:t>
+            </w:r>
+          </w:p>
+        </w:tc>
+      </w:tr>
+      <w:tr>
+        <w:tc>
+          <w:tcPr>
+            <w:tcW w:w="3005" w:type="dxa"/>
+          </w:tcPr>
+          <w:p>
+            <w:pPr>
+              <w:rPr>
+                <w:lang w:val="en-US"/>
+              </w:rPr>
+            </w:pPr>
+            <w:r>
+              <w:rPr>
+                <w:lang w:val="en-US"/>
+              </w:rPr>
+              <w:t>Finance System</w:t>
+            </w:r>
+          </w:p>
+        </w:tc>
+        <w:tc>
+          <w:tcPr>
+            <w:tcW w:w="3005" w:type="dxa"/>
+          </w:tcPr>
+          <w:p>
+            <w:pPr>
+              <w:rPr>
+                <w:lang w:val="en-US"/>
+              </w:rPr>
+            </w:pPr>
+            <w:r>
+              <w:rPr>
+                <w:lang w:val="en-US"/>
+              </w:rPr>
+              <w:t>Supporting actor</w:t>
+            </w:r>
+          </w:p>
+        </w:tc>
+        <w:tc>
+          <w:tcPr>
+            <w:tcW w:w="3006" w:type="dxa"/>
+          </w:tcPr>
+          <w:p>
+            <w:pPr>
+              <w:rPr>
+                <w:lang w:val="en-US"/>
+              </w:rPr>
+            </w:pPr>
+            <w:r>
+              <w:rPr>
+                <w:lang w:val="en-US"/>
+              </w:rPr>
+              <w:t>External system which provides invoices</w:t>
+            </w:r>
+          </w:p>
+        </w:tc>
+      </w:tr>
+    </w:tbl>
+    <w:p>
+      <w:pPr>
+        <w:rPr>
+          <w:lang w:val="en-US"/>
+        </w:rPr>
+      </w:pPr>
+    </w:p>
+    <w:p>
+      <w:pPr>
+        <w:pStyle w:val="Heading2"/>
+        <w:rPr>
+          <w:lang w:val="en-US"/>
+        </w:rPr>
+      </w:pPr>
+      <w:r>
+        <w:rPr>
+          <w:lang w:val="en-US"/>
+        </w:rPr>
+        <w:t xml:space="preserve">Requirements, Rules and uncertainty </w:t>
+      </w:r>
+    </w:p>
+    <w:p>
+      <w:pPr>
+        <w:pStyle w:val="Heading3"/>
+        <w:rPr>
+          <w:lang w:val="en-US"/>
+        </w:rPr>
+      </w:pPr>
+      <w:r>
+        <w:rPr>
+          <w:lang w:val="en-US"/>
+        </w:rPr>
+        <w:t>Functional Requirements</w:t>
+      </w:r>
+    </w:p>
+    <w:tbl>
+      <w:tblPr>
+        <w:tblStyle w:val="TableGrid"/>
+        <w:tblW w:w="9067" w:type="dxa"/>
+        <w:tblLook w:val="04A0" w:firstRow="1" w:lastRow="0" w:firstColumn="1" w:lastColumn="0" w:noHBand="0" w:noVBand="1"/>
+      </w:tblPr>
+      <w:tblGrid>
+        <w:gridCol w:w="965"/>
+        <w:gridCol w:w="5192"/>
+        <w:gridCol w:w="1358"/>
+        <w:gridCol w:w="1552"/>
+      </w:tblGrid>
+      <w:tr>
+        <w:tc>
+          <w:tcPr>
+            <w:tcW w:w="965" w:type="dxa"/>
+          </w:tcPr>
+          <w:p>
+            <w:pPr>
+              <w:rPr>
+                <w:lang w:val="en-US"/>
+              </w:rPr>
+            </w:pPr>
+            <w:r>
+              <w:rPr>
+                <w:lang w:val="en-US"/>
+              </w:rPr>
+              <w:t>ID</w:t>
+            </w:r>
+          </w:p>
+        </w:tc>
+        <w:tc>
+          <w:tcPr>
+            <w:tcW w:w="5192" w:type="dxa"/>
+          </w:tcPr>
+          <w:p>
+            <w:pPr>
+              <w:rPr>
+                <w:lang w:val="en-US"/>
+              </w:rPr>
+            </w:pPr>
+            <w:r>
+              <w:rPr>
+                <w:lang w:val="en-US"/>
+              </w:rPr>
+              <w:t>Functional Requirements</w:t>
+            </w:r>
+          </w:p>
+        </w:tc>
+        <w:tc>
+          <w:tcPr>
+            <w:tcW w:w="1358" w:type="dxa"/>
+          </w:tcPr>
+          <w:p>
+            <w:pPr>
+              <w:rPr>
+                <w:lang w:val="en-US"/>
+              </w:rPr>
+            </w:pPr>
+            <w:r>
+              <w:rPr>
+                <w:lang w:val="en-US"/>
+              </w:rPr>
+              <w:t>Priority</w:t>
+            </w:r>
+          </w:p>
+        </w:tc>
+        <w:tc>
+          <w:tcPr>
+            <w:tcW w:w="1552" w:type="dxa"/>
+          </w:tcPr>
+          <w:p>
+            <w:pPr>
+              <w:rPr>
+                <w:lang w:val="en-US"/>
+              </w:rPr>
+            </w:pPr>
+            <w:r>
+              <w:rPr>
+                <w:lang w:val="en-US"/>
+              </w:rPr>
+              <w:t>Source</w:t>
+            </w:r>
+          </w:p>
+        </w:tc>
+      </w:tr>
+      <w:tr>
+        <w:tc>
+          <w:tcPr>
+            <w:tcW w:w="965" w:type="dxa"/>
+          </w:tcPr>
+          <w:p>
+            <w:pPr>
+              <w:rPr>
+                <w:lang w:val="en-US"/>
+              </w:rPr>
+            </w:pPr>
+            <w:r>
+              <w:rPr>
+                <w:lang w:val="en-US"/>
+              </w:rPr>
+              <w:t>FR-01</w:t>
+            </w:r>
+          </w:p>
+        </w:tc>
+        <w:tc>
+          <w:tcPr>
+            <w:tcW w:w="5192" w:type="dxa"/>
+          </w:tcPr>
+          <w:p>
+            <w:pPr>
+              <w:rPr>
+                <w:lang w:val="en-US"/>
+              </w:rPr>
+            </w:pPr>
+            <w:r>
+              <w:rPr>
+                <w:lang w:val="en-US"/>
+              </w:rPr>
+              <w:t>The system should allow a reporter to create a record of a maintenance request with property, location, problem, person contact and access availability</w:t>
+            </w:r>
+          </w:p>
+        </w:tc>
+        <w:tc>
+          <w:tcPr>
+            <w:tcW w:w="1358" w:type="dxa"/>
+          </w:tcPr>
+          <w:p>
+            <w:pPr>
+              <w:rPr>
+                <w:lang w:val="en-US"/>
+              </w:rPr>
+            </w:pPr>
+            <w:r>
+              <w:rPr>
+                <w:lang w:val="en-US"/>
+              </w:rPr>
+              <w:t>Must</w:t>
+            </w:r>
+          </w:p>
+        </w:tc>
+        <w:tc>
+          <w:tcPr>
+            <w:tcW w:w="1552" w:type="dxa"/>
+          </w:tcPr>
+          <w:p>
+            <w:pPr>
+              <w:rPr>
+                <w:lang w:val="en-US"/>
+              </w:rPr>
+            </w:pPr>
+            <w:r>
+              <w:rPr>
+                <w:lang w:val="en-US"/>
+              </w:rPr>
+              <w:t>Occupant</w:t>
+            </w:r>
+            <w:r>
+              <w:rPr>
+                <w:lang w:val="en-US"/>
+              </w:rPr>
+              <w:t>, Responsible Organization</w:t>
+            </w:r>
+          </w:p>
+        </w:tc>
+      </w:tr>
+      <w:tr>
+        <w:tc>
+          <w:tcPr>
+            <w:tcW w:w="965" w:type="dxa"/>
+          </w:tcPr>
+          <w:p>
+            <w:pPr>
+              <w:rPr>
+                <w:lang w:val="en-US"/>
+              </w:rPr>
+            </w:pPr>
+            <w:r>
+              <w:rPr>
+                <w:lang w:val="en-US"/>
+              </w:rPr>
+              <w:t>FR-02</w:t>
+            </w:r>
+          </w:p>
+        </w:tc>
+        <w:tc>
+          <w:tcPr>
+            <w:tcW w:w="5192" w:type="dxa"/>
+          </w:tcPr>
+          <w:p>
+            <w:pPr>
+              <w:rPr>
+                <w:lang w:val="en-US"/>
+              </w:rPr>
+            </w:pPr>
+            <w:r>
+              <w:rPr>
+                <w:lang w:val="en-US"/>
+              </w:rPr>
+              <w:t>The system should notify the reporter of his report being discovered, an appointment confirmed or work has been completed</w:t>
+            </w:r>
+          </w:p>
+        </w:tc>
+        <w:tc>
+          <w:tcPr>
+            <w:tcW w:w="1358" w:type="dxa"/>
+          </w:tcPr>
+          <w:p>
+            <w:pPr>
+              <w:rPr>
+                <w:lang w:val="en-US"/>
+              </w:rPr>
+            </w:pPr>
+            <w:r>
+              <w:rPr>
+                <w:lang w:val="en-US"/>
+              </w:rPr>
+              <w:t>Should</w:t>
+            </w:r>
+          </w:p>
+        </w:tc>
+        <w:tc>
+          <w:tcPr>
+            <w:tcW w:w="1552" w:type="dxa"/>
+          </w:tcPr>
+          <w:p>
+            <w:pPr>
+              <w:rPr>
+                <w:lang w:val="en-US"/>
+              </w:rPr>
+            </w:pPr>
+            <w:r>
+              <w:rPr>
+                <w:lang w:val="en-US"/>
+              </w:rPr>
+              <w:t>Occupant</w:t>
+            </w:r>
+          </w:p>
+        </w:tc>
+      </w:tr>
+      <w:tr>
+        <w:tc>
+          <w:tcPr>
+            <w:tcW w:w="965" w:type="dxa"/>
+          </w:tcPr>
+          <w:p>
+            <w:pPr>
+              <w:rPr>
+                <w:lang w:val="en-US"/>
+              </w:rPr>
+            </w:pPr>
+            <w:r>
+              <w:rPr>
+                <w:lang w:val="en-US"/>
+              </w:rPr>
+              <w:t>FR-03</w:t>
+            </w:r>
+          </w:p>
+        </w:tc>
+        <w:tc>
+          <w:tcPr>
+            <w:tcW w:w="5192" w:type="dxa"/>
+          </w:tcPr>
+          <w:p>
+            <w:pPr>
+              <w:rPr>
+                <w:lang w:val="en-US"/>
+              </w:rPr>
+            </w:pPr>
+            <w:r>
+              <w:rPr>
+                <w:lang w:val="en-US"/>
+              </w:rPr>
+              <w:t xml:space="preserve">The system should allow coordinator to determine the decision to the report (accepted, returned for </w:t>
+            </w:r>
+            <w:r>
+              <w:rPr>
+                <w:lang w:val="en-US"/>
+              </w:rPr>
+              <w:lastRenderedPageBreak/>
+              <w:t>more information, referred, occupant’s responsibility)</w:t>
+            </w:r>
+          </w:p>
+        </w:tc>
+        <w:tc>
+          <w:tcPr>
+            <w:tcW w:w="1358" w:type="dxa"/>
+          </w:tcPr>
+          <w:p>
+            <w:pPr>
+              <w:rPr>
+                <w:lang w:val="en-US"/>
+              </w:rPr>
+            </w:pPr>
+            <w:r>
+              <w:rPr>
+                <w:lang w:val="en-US"/>
+              </w:rPr>
+              <w:lastRenderedPageBreak/>
+              <w:t>Must</w:t>
+            </w:r>
+          </w:p>
+        </w:tc>
+        <w:tc>
+          <w:tcPr>
+            <w:tcW w:w="1552" w:type="dxa"/>
+          </w:tcPr>
+          <w:p>
+            <w:pPr>
+              <w:rPr>
+                <w:lang w:val="en-US"/>
+              </w:rPr>
+            </w:pPr>
+            <w:r>
+              <w:rPr>
+                <w:lang w:val="en-US"/>
+              </w:rPr>
+              <w:t>Coordinator</w:t>
+            </w:r>
+          </w:p>
+        </w:tc>
+      </w:tr>
+      <w:tr>
+        <w:tc>
+          <w:tcPr>
+            <w:tcW w:w="965" w:type="dxa"/>
+          </w:tcPr>
+          <w:p>
+            <w:pPr>
+              <w:rPr>
+                <w:lang w:val="en-US"/>
+              </w:rPr>
+            </w:pPr>
+            <w:r>
+              <w:rPr>
+                <w:lang w:val="en-US"/>
+              </w:rPr>
+              <w:t>FR-04</w:t>
+            </w:r>
+          </w:p>
+        </w:tc>
+        <w:tc>
+          <w:tcPr>
+            <w:tcW w:w="5192" w:type="dxa"/>
+          </w:tcPr>
+          <w:p>
+            <w:pPr>
+              <w:rPr>
+                <w:lang w:val="en-US"/>
+              </w:rPr>
+            </w:pPr>
+            <w:r>
+              <w:rPr>
+                <w:lang w:val="en-US"/>
+              </w:rPr>
+              <w:t>The system should allow coordinator to determine priority level of a problem and escalate to the contractor</w:t>
+            </w:r>
+          </w:p>
+        </w:tc>
+        <w:tc>
+          <w:tcPr>
+            <w:tcW w:w="1358" w:type="dxa"/>
+          </w:tcPr>
+          <w:p>
+            <w:pPr>
+              <w:rPr>
+                <w:lang w:val="en-US"/>
+              </w:rPr>
+            </w:pPr>
+            <w:r>
+              <w:rPr>
+                <w:lang w:val="en-US"/>
+              </w:rPr>
+              <w:t>MUST</w:t>
+            </w:r>
+          </w:p>
+        </w:tc>
+        <w:tc>
+          <w:tcPr>
+            <w:tcW w:w="1552" w:type="dxa"/>
+          </w:tcPr>
+          <w:p>
+            <w:pPr>
+              <w:rPr>
+                <w:lang w:val="en-US"/>
+              </w:rPr>
+            </w:pPr>
+            <w:r>
+              <w:rPr>
+                <w:lang w:val="en-US"/>
+              </w:rPr>
+              <w:t>Coordinator</w:t>
+            </w:r>
+          </w:p>
+        </w:tc>
+      </w:tr>
+      <w:tr>
+        <w:tc>
+          <w:tcPr>
+            <w:tcW w:w="965" w:type="dxa"/>
+          </w:tcPr>
+          <w:p>
+            <w:pPr>
+              <w:rPr>
+                <w:lang w:val="en-US"/>
+              </w:rPr>
+            </w:pPr>
+            <w:r>
+              <w:rPr>
+                <w:lang w:val="en-US"/>
+              </w:rPr>
+              <w:t>FR-05</w:t>
+            </w:r>
+          </w:p>
+        </w:tc>
+        <w:tc>
+          <w:tcPr>
+            <w:tcW w:w="5192" w:type="dxa"/>
+          </w:tcPr>
+          <w:p>
+            <w:pPr>
+              <w:rPr>
+                <w:lang w:val="en-US"/>
+              </w:rPr>
+            </w:pPr>
+            <w:r>
+              <w:rPr>
+                <w:lang w:val="en-US"/>
+              </w:rPr>
+              <w:t>The system should allow coordinator to link duplicated reports with each other and split one request into different jobs</w:t>
+            </w:r>
+          </w:p>
+        </w:tc>
+        <w:tc>
+          <w:tcPr>
+            <w:tcW w:w="1358" w:type="dxa"/>
+          </w:tcPr>
+          <w:p>
+            <w:pPr>
+              <w:rPr>
+                <w:lang w:val="en-US"/>
+              </w:rPr>
+            </w:pPr>
+            <w:r>
+              <w:rPr>
+                <w:lang w:val="en-US"/>
+              </w:rPr>
+              <w:t>Should</w:t>
+            </w:r>
+          </w:p>
+        </w:tc>
+        <w:tc>
+          <w:tcPr>
+            <w:tcW w:w="1552" w:type="dxa"/>
+          </w:tcPr>
+          <w:p>
+            <w:pPr>
+              <w:rPr>
+                <w:lang w:val="en-US"/>
+              </w:rPr>
+            </w:pPr>
+            <w:r>
+              <w:rPr>
+                <w:lang w:val="en-US"/>
+              </w:rPr>
+              <w:t>Coordinator</w:t>
+            </w:r>
+          </w:p>
+        </w:tc>
+      </w:tr>
+      <w:tr>
+        <w:tc>
+          <w:tcPr>
+            <w:tcW w:w="965" w:type="dxa"/>
+          </w:tcPr>
+          <w:p>
+            <w:pPr>
+              <w:rPr>
+                <w:lang w:val="en-US"/>
+              </w:rPr>
+            </w:pPr>
+            <w:r>
+              <w:rPr>
+                <w:lang w:val="en-US"/>
+              </w:rPr>
+              <w:t>FR-06</w:t>
+            </w:r>
+          </w:p>
+        </w:tc>
+        <w:tc>
+          <w:tcPr>
+            <w:tcW w:w="5192" w:type="dxa"/>
+          </w:tcPr>
+          <w:p>
+            <w:pPr>
+              <w:rPr>
+                <w:lang w:val="en-US"/>
+              </w:rPr>
+            </w:pPr>
+            <w:r>
+              <w:rPr>
+                <w:lang w:val="en-US"/>
+              </w:rPr>
+              <w:t xml:space="preserve">The system should allow </w:t>
+            </w:r>
+            <w:r>
+              <w:rPr>
+                <w:lang w:val="en-US"/>
+              </w:rPr>
+              <w:t xml:space="preserve">coordinator </w:t>
+            </w:r>
+            <w:r>
+              <w:rPr>
+                <w:lang w:val="en-US"/>
+              </w:rPr>
+              <w:t xml:space="preserve">to match the job to the contractor whose trade, </w:t>
+            </w:r>
+            <w:r>
+              <w:rPr>
+                <w:lang w:val="en-US"/>
+              </w:rPr>
+              <w:t>location, availability, access requirements and whether specialist certification is needed</w:t>
+            </w:r>
+          </w:p>
+        </w:tc>
+        <w:tc>
+          <w:tcPr>
+            <w:tcW w:w="1358" w:type="dxa"/>
+          </w:tcPr>
+          <w:p>
+            <w:pPr>
+              <w:rPr>
+                <w:lang w:val="en-US"/>
+              </w:rPr>
+            </w:pPr>
+            <w:r>
+              <w:rPr>
+                <w:lang w:val="en-US"/>
+              </w:rPr>
+              <w:t>Must</w:t>
+            </w:r>
+          </w:p>
+        </w:tc>
+        <w:tc>
+          <w:tcPr>
+            <w:tcW w:w="1552" w:type="dxa"/>
+          </w:tcPr>
+          <w:p>
+            <w:pPr>
+              <w:rPr>
+                <w:lang w:val="en-US"/>
+              </w:rPr>
+            </w:pPr>
+            <w:r>
+              <w:rPr>
+                <w:lang w:val="en-US"/>
+              </w:rPr>
+              <w:t>Coordinator</w:t>
+            </w:r>
+          </w:p>
+        </w:tc>
+      </w:tr>
+      <w:tr>
+        <w:tc>
+          <w:tcPr>
+            <w:tcW w:w="965" w:type="dxa"/>
+          </w:tcPr>
+          <w:p>
+            <w:pPr>
+              <w:rPr>
+                <w:lang w:val="en-US"/>
+              </w:rPr>
+            </w:pPr>
+            <w:r>
+              <w:rPr>
+                <w:lang w:val="en-US"/>
+              </w:rPr>
+              <w:t>FR-07</w:t>
+            </w:r>
+          </w:p>
+        </w:tc>
+        <w:tc>
+          <w:tcPr>
+            <w:tcW w:w="5192" w:type="dxa"/>
+          </w:tcPr>
+          <w:p>
+            <w:pPr>
+              <w:rPr>
+                <w:lang w:val="en-US"/>
+              </w:rPr>
+            </w:pPr>
+            <w:r>
+              <w:rPr>
+                <w:lang w:val="en-US"/>
+              </w:rPr>
+              <w:t>The system shall monitor access arrangements and whether access is being confirmed</w:t>
+            </w:r>
+          </w:p>
+        </w:tc>
+        <w:tc>
+          <w:tcPr>
+            <w:tcW w:w="1358" w:type="dxa"/>
+          </w:tcPr>
+          <w:p>
+            <w:pPr>
+              <w:rPr>
+                <w:lang w:val="en-US"/>
+              </w:rPr>
+            </w:pPr>
+            <w:r>
+              <w:rPr>
+                <w:lang w:val="en-US"/>
+              </w:rPr>
+              <w:t>Must</w:t>
+            </w:r>
+          </w:p>
+        </w:tc>
+        <w:tc>
+          <w:tcPr>
+            <w:tcW w:w="1552" w:type="dxa"/>
+          </w:tcPr>
+          <w:p>
+            <w:pPr>
+              <w:rPr>
+                <w:lang w:val="en-US"/>
+              </w:rPr>
+            </w:pPr>
+            <w:r>
+              <w:rPr>
+                <w:lang w:val="en-US"/>
+              </w:rPr>
+              <w:t>Contractor, Caretaker, Occupant,</w:t>
+            </w:r>
+          </w:p>
+          <w:p>
+            <w:pPr>
+              <w:rPr>
+                <w:lang w:val="en-US"/>
+              </w:rPr>
+            </w:pPr>
+            <w:r>
+              <w:rPr>
+                <w:lang w:val="en-US"/>
+              </w:rPr>
+              <w:t>Responsible Organization</w:t>
+            </w:r>
+          </w:p>
+        </w:tc>
+      </w:tr>
+      <w:tr>
+        <w:tc>
+          <w:tcPr>
+            <w:tcW w:w="965" w:type="dxa"/>
+          </w:tcPr>
+          <w:p>
+            <w:pPr>
+              <w:rPr>
+                <w:lang w:val="en-US"/>
+              </w:rPr>
+            </w:pPr>
+            <w:r>
+              <w:rPr>
+                <w:lang w:val="en-US"/>
+              </w:rPr>
+              <w:t>FR-08</w:t>
+            </w:r>
+          </w:p>
+        </w:tc>
+        <w:tc>
+          <w:tcPr>
+            <w:tcW w:w="5192" w:type="dxa"/>
+          </w:tcPr>
+          <w:p>
+            <w:pPr>
+              <w:rPr>
+                <w:lang w:val="en-US"/>
+              </w:rPr>
+            </w:pPr>
+            <w:r>
+              <w:rPr>
+                <w:lang w:val="en-US"/>
+              </w:rPr>
+              <w:t>The system should allow an authorized approver to approve contractor, quotation and temporary repairs</w:t>
+            </w:r>
+          </w:p>
+        </w:tc>
+        <w:tc>
+          <w:tcPr>
+            <w:tcW w:w="1358" w:type="dxa"/>
+          </w:tcPr>
+          <w:p>
+            <w:pPr>
+              <w:rPr>
+                <w:lang w:val="en-US"/>
+              </w:rPr>
+            </w:pPr>
+            <w:r>
+              <w:rPr>
+                <w:lang w:val="en-US"/>
+              </w:rPr>
+              <w:t>Assumption</w:t>
+            </w:r>
+          </w:p>
+        </w:tc>
+        <w:tc>
+          <w:tcPr>
+            <w:tcW w:w="1552" w:type="dxa"/>
+          </w:tcPr>
+          <w:p>
+            <w:pPr>
+              <w:rPr>
+                <w:lang w:val="en-US"/>
+              </w:rPr>
+            </w:pPr>
+            <w:r>
+              <w:rPr>
+                <w:lang w:val="en-US"/>
+              </w:rPr>
+              <w:t>Contractor,</w:t>
+            </w:r>
+          </w:p>
+          <w:p>
+            <w:pPr>
+              <w:rPr>
+                <w:lang w:val="en-US"/>
+              </w:rPr>
+            </w:pPr>
+            <w:r>
+              <w:rPr>
+                <w:lang w:val="en-US"/>
+              </w:rPr>
+              <w:t>Responsible Organization</w:t>
+            </w:r>
+          </w:p>
+        </w:tc>
+      </w:tr>
+      <w:tr>
+        <w:tc>
+          <w:tcPr>
+            <w:tcW w:w="965" w:type="dxa"/>
+          </w:tcPr>
+          <w:p>
+            <w:pPr>
+              <w:rPr>
+                <w:lang w:val="en-US"/>
+              </w:rPr>
+            </w:pPr>
+            <w:r>
+              <w:rPr>
+                <w:lang w:val="en-US"/>
+              </w:rPr>
+              <w:t>FR-09</w:t>
+            </w:r>
+          </w:p>
+        </w:tc>
+        <w:tc>
+          <w:tcPr>
+            <w:tcW w:w="5192" w:type="dxa"/>
+          </w:tcPr>
+          <w:p>
+            <w:pPr>
+              <w:rPr>
+                <w:lang w:val="en-US"/>
+              </w:rPr>
+            </w:pPr>
+            <w:r>
+              <w:rPr>
+                <w:lang w:val="en-US"/>
+              </w:rPr>
+              <w:t>The system should allow a technician to report outcomes of each visi</w:t>
+            </w:r>
+            <w:r>
+              <w:rPr>
+                <w:lang w:val="en-US"/>
+              </w:rPr>
+              <w:t>t, provide photos and price of parts</w:t>
+            </w:r>
+          </w:p>
+        </w:tc>
+        <w:tc>
+          <w:tcPr>
+            <w:tcW w:w="1358" w:type="dxa"/>
+          </w:tcPr>
+          <w:p>
+            <w:pPr>
+              <w:rPr>
+                <w:lang w:val="en-US"/>
+              </w:rPr>
+            </w:pPr>
+            <w:r>
+              <w:rPr>
+                <w:lang w:val="en-US"/>
+              </w:rPr>
+              <w:t>Must</w:t>
+            </w:r>
+          </w:p>
+        </w:tc>
+        <w:tc>
+          <w:tcPr>
+            <w:tcW w:w="1552" w:type="dxa"/>
+          </w:tcPr>
+          <w:p>
+            <w:pPr>
+              <w:rPr>
+                <w:lang w:val="en-US"/>
+              </w:rPr>
+            </w:pPr>
+            <w:r>
+              <w:rPr>
+                <w:lang w:val="en-US"/>
+              </w:rPr>
+              <w:t>Contractor,</w:t>
+            </w:r>
+          </w:p>
+          <w:p>
+            <w:pPr>
+              <w:rPr>
+                <w:lang w:val="en-US"/>
+              </w:rPr>
+            </w:pPr>
+            <w:r>
+              <w:rPr>
+                <w:lang w:val="en-US"/>
+              </w:rPr>
+              <w:t>External Contractor</w:t>
+            </w:r>
+          </w:p>
+        </w:tc>
+      </w:tr>
+      <w:tr>
+        <w:tc>
+          <w:tcPr>
+            <w:tcW w:w="965" w:type="dxa"/>
+          </w:tcPr>
+          <w:p>
+            <w:pPr>
+              <w:rPr>
+                <w:lang w:val="en-US"/>
+              </w:rPr>
+            </w:pPr>
+            <w:r>
+              <w:rPr>
+                <w:lang w:val="en-US"/>
+              </w:rPr>
+              <w:t>FR-10</w:t>
+            </w:r>
+          </w:p>
+        </w:tc>
+        <w:tc>
+          <w:tcPr>
+            <w:tcW w:w="5192" w:type="dxa"/>
+          </w:tcPr>
+          <w:p>
+            <w:pPr>
+              <w:rPr>
+                <w:lang w:val="en-US"/>
+              </w:rPr>
+            </w:pPr>
+            <w:r>
+              <w:rPr>
+                <w:lang w:val="en-US"/>
+              </w:rPr>
+              <w:t>The system should link a new report of a problem at the same location and break to the recurring problem</w:t>
+            </w:r>
+          </w:p>
+        </w:tc>
+        <w:tc>
+          <w:tcPr>
+            <w:tcW w:w="1358" w:type="dxa"/>
+          </w:tcPr>
+          <w:p>
+            <w:pPr>
+              <w:rPr>
+                <w:lang w:val="en-US"/>
+              </w:rPr>
+            </w:pPr>
+            <w:r>
+              <w:rPr>
+                <w:lang w:val="en-US"/>
+              </w:rPr>
+              <w:t>Must</w:t>
+            </w:r>
+          </w:p>
+        </w:tc>
+        <w:tc>
+          <w:tcPr>
+            <w:tcW w:w="1552" w:type="dxa"/>
+          </w:tcPr>
+          <w:p>
+            <w:pPr>
+              <w:rPr>
+                <w:lang w:val="en-US"/>
+              </w:rPr>
+            </w:pPr>
+            <w:r>
+              <w:rPr>
+                <w:lang w:val="en-US"/>
+              </w:rPr>
+              <w:t>Property Manager</w:t>
+            </w:r>
+          </w:p>
+        </w:tc>
+      </w:tr>
+      <w:tr>
+        <w:tc>
+          <w:tcPr>
+            <w:tcW w:w="965" w:type="dxa"/>
+          </w:tcPr>
+          <w:p>
+            <w:pPr>
+              <w:rPr>
+                <w:lang w:val="en-US"/>
+              </w:rPr>
+            </w:pPr>
+            <w:r>
+              <w:rPr>
+                <w:lang w:val="en-US"/>
+              </w:rPr>
+              <w:t>FR-11</w:t>
+            </w:r>
+          </w:p>
+        </w:tc>
+        <w:tc>
+          <w:tcPr>
+            <w:tcW w:w="5192" w:type="dxa"/>
+          </w:tcPr>
+          <w:p>
+            <w:pPr>
+              <w:rPr>
+                <w:lang w:val="en-US"/>
+              </w:rPr>
+            </w:pPr>
+            <w:r>
+              <w:rPr>
+                <w:lang w:val="en-US"/>
+              </w:rPr>
+              <w:t>The system should allow the property manager to access views of open requests, overdue jobs, repeated faults, contractor workload, temporary repairs and properties with recurring problems</w:t>
+            </w:r>
+          </w:p>
+        </w:tc>
+        <w:tc>
+          <w:tcPr>
+            <w:tcW w:w="1358" w:type="dxa"/>
+          </w:tcPr>
+          <w:p>
+            <w:pPr>
+              <w:rPr>
+                <w:lang w:val="en-US"/>
+              </w:rPr>
+            </w:pPr>
+            <w:r>
+              <w:rPr>
+                <w:lang w:val="en-US"/>
+              </w:rPr>
+              <w:t>Should</w:t>
+            </w:r>
+          </w:p>
+        </w:tc>
+        <w:tc>
+          <w:tcPr>
+            <w:tcW w:w="1552" w:type="dxa"/>
+          </w:tcPr>
+          <w:p>
+            <w:pPr>
+              <w:rPr>
+                <w:lang w:val="en-US"/>
+              </w:rPr>
+            </w:pPr>
+            <w:r>
+              <w:rPr>
+                <w:lang w:val="en-US"/>
+              </w:rPr>
+              <w:t>Property Manager</w:t>
+            </w:r>
+          </w:p>
+        </w:tc>
+      </w:tr>
+    </w:tbl>
+    <w:p>
+      <w:pPr>
+        <w:rPr>
+          <w:lang w:val="en-US"/>
+        </w:rPr>
+      </w:pPr>
+    </w:p>
+    <w:p>
+      <w:pPr>
+        <w:pStyle w:val="Heading3"/>
+        <w:rPr>
+          <w:lang w:val="en-US"/>
+        </w:rPr>
+      </w:pPr>
+      <w:r>
+        <w:rPr>
+          <w:lang w:val="en-US"/>
+        </w:rPr>
+        <w:t>Non-functional Requirements</w:t>
+      </w:r>
+    </w:p>
+    <w:tbl>
+      <w:tblPr>
+        <w:tblStyle w:val="TableGrid"/>
+        <w:tblW w:w="0" w:type="auto"/>
+        <w:tblLook w:val="04A0" w:firstRow="1" w:lastRow="0" w:firstColumn="1" w:lastColumn="0" w:noHBand="0" w:noVBand="1"/>
+      </w:tblPr>
+      <w:tblGrid>
+        <w:gridCol w:w="2689"/>
+        <w:gridCol w:w="4677"/>
+        <w:gridCol w:w="1650"/>
+      </w:tblGrid>
+      <w:tr>
+        <w:tc>
+          <w:tcPr>
+            <w:tcW w:w="2689" w:type="dxa"/>
+          </w:tcPr>
+          <w:p>
+            <w:pPr>
+              <w:rPr>
+                <w:lang w:val="en-US"/>
+              </w:rPr>
+            </w:pPr>
+            <w:r>
+              <w:rPr>
+                <w:lang w:val="en-US"/>
+              </w:rPr>
+              <w:t>Weak Statement</w:t>
+            </w:r>
+          </w:p>
+        </w:tc>
+        <w:tc>
+          <w:tcPr>
+            <w:tcW w:w="4677" w:type="dxa"/>
+          </w:tcPr>
+          <w:p>
+            <w:pPr>
+              <w:rPr>
+                <w:lang w:val="en-US"/>
+              </w:rPr>
+            </w:pPr>
+            <w:r>
+              <w:rPr>
+                <w:lang w:val="en-US"/>
+              </w:rPr>
+              <w:t>Measurable Statement</w:t>
+            </w:r>
+          </w:p>
+        </w:tc>
+        <w:tc>
+          <w:tcPr>
+            <w:tcW w:w="1650" w:type="dxa"/>
+          </w:tcPr>
+          <w:p>
+            <w:pPr>
+              <w:rPr>
+                <w:lang w:val="en-US"/>
+              </w:rPr>
+            </w:pPr>
+            <w:r>
+              <w:rPr>
+                <w:lang w:val="en-US"/>
+              </w:rPr>
+              <w:t>Quality</w:t>
+            </w:r>
+          </w:p>
+        </w:tc>
+      </w:tr>
+      <w:tr>
+        <w:tc>
+          <w:tcPr>
+            <w:tcW w:w="2689" w:type="dxa"/>
+          </w:tcPr>
+          <w:p>
+            <w:pPr>
+              <w:rPr>
+                <w:lang w:val="en-US"/>
+              </w:rPr>
+            </w:pPr>
+            <w:r>
+              <w:rPr>
+                <w:lang w:val="en-US"/>
+              </w:rPr>
+              <w:t>Reporting should be easy</w:t>
+            </w:r>
+          </w:p>
+        </w:tc>
+        <w:tc>
+          <w:tcPr>
+            <w:tcW w:w="4677" w:type="dxa"/>
+          </w:tcPr>
+          <w:p>
+            <w:pPr>
+              <w:rPr>
+                <w:lang w:val="en-US"/>
+              </w:rPr>
+            </w:pPr>
+            <w:r>
+              <w:rPr>
+                <w:lang w:val="en-US"/>
+              </w:rPr>
+              <w:t>In 90% of cases reporters must be able to submit a report within 5 minutes from the start</w:t>
+            </w:r>
+          </w:p>
+        </w:tc>
+        <w:tc>
+          <w:tcPr>
+            <w:tcW w:w="1650" w:type="dxa"/>
+          </w:tcPr>
+          <w:p>
+            <w:pPr>
+              <w:rPr>
+                <w:lang w:val="en-US"/>
+              </w:rPr>
+            </w:pPr>
+            <w:r>
+              <w:rPr>
+                <w:lang w:val="en-US"/>
+              </w:rPr>
+              <w:t>Usability</w:t>
+            </w:r>
+          </w:p>
+        </w:tc>
+      </w:tr>
+      <w:tr>
+        <w:tc>
+          <w:tcPr>
+            <w:tcW w:w="2689" w:type="dxa"/>
+          </w:tcPr>
+          <w:p>
+            <w:pPr>
+              <w:rPr>
+                <w:lang w:val="en-US"/>
+              </w:rPr>
+            </w:pPr>
+            <w:r>
+              <w:rPr>
+                <w:lang w:val="en-US"/>
+              </w:rPr>
+              <w:t>Contractors should not see private data</w:t>
+            </w:r>
+          </w:p>
+        </w:tc>
+        <w:tc>
+          <w:tcPr>
+            <w:tcW w:w="4677" w:type="dxa"/>
+          </w:tcPr>
+          <w:p>
+            <w:pPr>
+              <w:rPr>
+                <w:lang w:val="en-US"/>
+              </w:rPr>
+            </w:pPr>
+            <w:r>
+              <w:rPr>
+                <w:lang w:val="en-US"/>
+              </w:rPr>
+              <w:t>Worker must only see property, location, contact of caretaker/occupant, access availability.</w:t>
+            </w:r>
+          </w:p>
+        </w:tc>
+        <w:tc>
+          <w:tcPr>
+            <w:tcW w:w="1650" w:type="dxa"/>
+          </w:tcPr>
+          <w:p>
+            <w:pPr>
+              <w:rPr>
+                <w:lang w:val="en-US"/>
+              </w:rPr>
+            </w:pPr>
+            <w:r>
+              <w:rPr>
+                <w:lang w:val="en-US"/>
+              </w:rPr>
+              <w:t>Privacy</w:t>
+            </w:r>
+          </w:p>
+        </w:tc>
+      </w:tr>
+      <w:tr>
+        <w:tc>
+          <w:tcPr>
+            <w:tcW w:w="2689" w:type="dxa"/>
+          </w:tcPr>
+          <w:p>
+            <w:pPr>
+              <w:rPr>
+                <w:lang w:val="en-US"/>
+              </w:rPr>
+            </w:pPr>
+            <w:r>
+              <w:rPr>
+                <w:lang w:val="en-US"/>
+              </w:rPr>
+              <w:t>Reporters should get replies quickly</w:t>
+            </w:r>
+          </w:p>
+        </w:tc>
+        <w:tc>
+          <w:tcPr>
+            <w:tcW w:w="4677" w:type="dxa"/>
+          </w:tcPr>
+          <w:p>
+            <w:pPr>
+              <w:rPr>
+                <w:lang w:val="en-US"/>
+              </w:rPr>
+            </w:pPr>
+            <w:r>
+              <w:rPr>
+                <w:lang w:val="en-US"/>
+              </w:rPr>
+              <w:t>An acknowledgment should be visible to reporter within an hour from the application period, during working time</w:t>
+            </w:r>
+          </w:p>
+        </w:tc>
+        <w:tc>
+          <w:tcPr>
+            <w:tcW w:w="1650" w:type="dxa"/>
+          </w:tcPr>
+          <w:p>
+            <w:pPr>
+              <w:rPr>
+                <w:lang w:val="en-US"/>
+              </w:rPr>
+            </w:pPr>
+            <w:r>
+              <w:rPr>
+                <w:lang w:val="en-US"/>
+              </w:rPr>
+              <w:t>Performance</w:t>
+            </w:r>
+          </w:p>
+        </w:tc>
+      </w:tr>
+      <w:tr>
+        <w:tc>
+          <w:tcPr>
+            <w:tcW w:w="2689" w:type="dxa"/>
+          </w:tcPr>
+          <w:p>
+            <w:pPr>
+              <w:rPr>
+                <w:lang w:val="en-US"/>
+              </w:rPr>
+            </w:pPr>
+            <w:r>
+              <w:rPr>
+                <w:lang w:val="en-US"/>
+              </w:rPr>
+              <w:t>Changes should be tracked</w:t>
+            </w:r>
+          </w:p>
+        </w:tc>
+        <w:tc>
+          <w:tcPr>
+            <w:tcW w:w="4677" w:type="dxa"/>
+          </w:tcPr>
+          <w:p>
+            <w:pPr>
+              <w:rPr>
+                <w:lang w:val="en-US"/>
+              </w:rPr>
+            </w:pPr>
+            <w:r>
+              <w:rPr>
+                <w:lang w:val="en-US"/>
+              </w:rPr>
+              <w:t>100% of changes, approvals, referrals or closures must record who made them, when and why</w:t>
+            </w:r>
+          </w:p>
+        </w:tc>
+        <w:tc>
+          <w:tcPr>
+            <w:tcW w:w="1650" w:type="dxa"/>
+          </w:tcPr>
+          <w:p>
+            <w:pPr>
+              <w:rPr>
+                <w:lang w:val="en-US"/>
+              </w:rPr>
+            </w:pPr>
+            <w:r>
+              <w:rPr>
+                <w:lang w:val="en-US"/>
+              </w:rPr>
+              <w:t>Performance</w:t>
+            </w:r>
+          </w:p>
+        </w:tc>
+      </w:tr>
+    </w:tbl>
+    <w:p>
+      <w:pPr>
+        <w:rPr>
+          <w:lang w:val="en-US"/>
+        </w:rPr>
+      </w:pPr>
+    </w:p>
+    <w:p>
+      <w:pPr>
+        <w:rPr>
+          <w:lang w:val="en-US"/>
+        </w:rPr>
+      </w:pPr>
+    </w:p>
+    <w:p>
+      <w:pPr>
+        <w:pStyle w:val="Heading3"/>
+        <w:rPr>
+          <w:lang w:val="en-US"/>
+        </w:rPr>
+      </w:pPr>
+      <w:r>
+        <w:rPr>
+          <w:lang w:val="en-US"/>
+        </w:rPr>
+        <w:lastRenderedPageBreak/>
+        <w:t>MoSCoW Priority</w:t>
+      </w:r>
+    </w:p>
+    <w:tbl>
+      <w:tblPr>
+        <w:tblStyle w:val="TableGrid"/>
+        <w:tblW w:w="0" w:type="auto"/>
+        <w:tblLook w:val="04A0" w:firstRow="1" w:lastRow="0" w:firstColumn="1" w:lastColumn="0" w:noHBand="0" w:noVBand="1"/>
+      </w:tblPr>
+      <w:tblGrid>
+        <w:gridCol w:w="1696"/>
+        <w:gridCol w:w="3119"/>
+        <w:gridCol w:w="4201"/>
+      </w:tblGrid>
+      <w:tr>
+        <w:tc>
+          <w:tcPr>
+            <w:tcW w:w="1696" w:type="dxa"/>
+          </w:tcPr>
+          <w:p>
+            <w:pPr>
+              <w:rPr>
+                <w:lang w:val="en-US"/>
+              </w:rPr>
+            </w:pPr>
+            <w:r>
+              <w:rPr>
+                <w:lang w:val="en-US"/>
+              </w:rPr>
+              <w:t>Priority</w:t>
+            </w:r>
+          </w:p>
+        </w:tc>
+        <w:tc>
+          <w:tcPr>
+            <w:tcW w:w="3119" w:type="dxa"/>
+          </w:tcPr>
+          <w:p>
+            <w:pPr>
+              <w:rPr>
+                <w:lang w:val="en-US"/>
+              </w:rPr>
+            </w:pPr>
+            <w:r>
+              <w:rPr>
+                <w:lang w:val="en-US"/>
+              </w:rPr>
+              <w:t>Meaning</w:t>
+            </w:r>
+          </w:p>
+        </w:tc>
+        <w:tc>
+          <w:tcPr>
+            <w:tcW w:w="4201" w:type="dxa"/>
+          </w:tcPr>
+          <w:p>
+            <w:pPr>
+              <w:rPr>
+                <w:lang w:val="en-US"/>
+              </w:rPr>
+            </w:pPr>
+            <w:r>
+              <w:rPr>
+                <w:lang w:val="en-US"/>
+              </w:rPr>
+              <w:t>Interpretation</w:t>
+            </w:r>
+          </w:p>
+        </w:tc>
+      </w:tr>
+      <w:tr>
+        <w:tc>
+          <w:tcPr>
+            <w:tcW w:w="1696" w:type="dxa"/>
+          </w:tcPr>
+          <w:p>
+            <w:pPr>
+              <w:rPr>
+                <w:lang w:val="en-US"/>
+              </w:rPr>
+            </w:pPr>
+            <w:r>
+              <w:rPr>
+                <w:lang w:val="en-US"/>
+              </w:rPr>
+              <w:t>Must</w:t>
+            </w:r>
+          </w:p>
+        </w:tc>
+        <w:tc>
+          <w:tcPr>
+            <w:tcW w:w="3119" w:type="dxa"/>
+          </w:tcPr>
+          <w:p>
+            <w:pPr>
+              <w:rPr>
+                <w:lang w:val="en-US"/>
+              </w:rPr>
+            </w:pPr>
+            <w:r>
+              <w:t>Essential to achieve the release purpose</w:t>
+            </w:r>
+          </w:p>
+        </w:tc>
+        <w:tc>
+          <w:tcPr>
+            <w:tcW w:w="4201" w:type="dxa"/>
+          </w:tcPr>
+          <w:p>
+            <w:pPr>
+              <w:rPr>
+                <w:lang w:val="en-US"/>
+              </w:rPr>
+            </w:pPr>
+            <w:r>
+              <w:rPr>
+                <w:lang w:val="en-US"/>
+              </w:rPr>
+              <w:t>Record requests, priority testament, allocation, confirm access, approval, record, link recurring faults</w:t>
+            </w:r>
+          </w:p>
+        </w:tc>
+      </w:tr>
+      <w:tr>
+        <w:tc>
+          <w:tcPr>
+            <w:tcW w:w="1696" w:type="dxa"/>
+          </w:tcPr>
+          <w:p>
+            <w:pPr>
+              <w:rPr>
+                <w:lang w:val="en-US"/>
+              </w:rPr>
+            </w:pPr>
+            <w:r>
+              <w:rPr>
+                <w:lang w:val="en-US"/>
+              </w:rPr>
+              <w:t>Should</w:t>
+            </w:r>
+          </w:p>
+        </w:tc>
+        <w:tc>
+          <w:tcPr>
+            <w:tcW w:w="3119" w:type="dxa"/>
+          </w:tcPr>
+          <w:p>
+            <w:pPr>
+              <w:rPr>
+                <w:lang w:val="en-US"/>
+              </w:rPr>
+            </w:pPr>
+            <w:r>
+              <w:t>Important, but a workaround exists</w:t>
+            </w:r>
+          </w:p>
+        </w:tc>
+        <w:tc>
+          <w:tcPr>
+            <w:tcW w:w="4201" w:type="dxa"/>
+          </w:tcPr>
+          <w:p>
+            <w:pPr>
+              <w:rPr>
+                <w:lang w:val="en-US"/>
+              </w:rPr>
+            </w:pPr>
+            <w:r>
+              <w:rPr>
+                <w:lang w:val="en-US"/>
+              </w:rPr>
+              <w:t xml:space="preserve">Duplicate linking </w:t>
+            </w:r>
+          </w:p>
+        </w:tc>
+      </w:tr>
+      <w:tr>
+        <w:tc>
+          <w:tcPr>
+            <w:tcW w:w="1696" w:type="dxa"/>
+          </w:tcPr>
+          <w:p>
+            <w:pPr>
+              <w:rPr>
+                <w:lang w:val="en-US"/>
+              </w:rPr>
+            </w:pPr>
+            <w:r>
+              <w:rPr>
+                <w:lang w:val="en-US"/>
+              </w:rPr>
+              <w:t>Could</w:t>
+            </w:r>
+          </w:p>
+        </w:tc>
+        <w:tc>
+          <w:tcPr>
+            <w:tcW w:w="3119" w:type="dxa"/>
+          </w:tcPr>
+          <w:p>
+            <w:pPr>
+              <w:rPr>
+                <w:lang w:val="en-US"/>
+              </w:rPr>
+            </w:pPr>
+            <w:r>
+              <w:t>Desirable if time permits</w:t>
+            </w:r>
+          </w:p>
+        </w:tc>
+        <w:tc>
+          <w:tcPr>
+            <w:tcW w:w="4201" w:type="dxa"/>
+          </w:tcPr>
+          <w:p>
+            <w:pPr>
+              <w:rPr>
+                <w:lang w:val="en-US"/>
+              </w:rPr>
+            </w:pPr>
+            <w:r>
+              <w:rPr>
+                <w:lang w:val="en-US"/>
+              </w:rPr>
+              <w:t>Reporter notifications</w:t>
+            </w:r>
+          </w:p>
+        </w:tc>
+      </w:tr>
+      <w:tr>
+        <w:tc>
+          <w:tcPr>
+            <w:tcW w:w="1696" w:type="dxa"/>
+          </w:tcPr>
+          <w:p>
+            <w:pPr>
+              <w:rPr>
+                <w:lang w:val="en-US"/>
+              </w:rPr>
+            </w:pPr>
+            <w:r>
+              <w:rPr>
+                <w:lang w:val="en-US"/>
+              </w:rPr>
+              <w:t>Won’t this time</w:t>
+            </w:r>
+          </w:p>
+        </w:tc>
+        <w:tc>
+          <w:tcPr>
+            <w:tcW w:w="3119" w:type="dxa"/>
+          </w:tcPr>
+          <w:p>
+            <w:pPr>
+              <w:rPr>
+                <w:lang w:val="en-US"/>
+              </w:rPr>
+            </w:pPr>
+            <w:r>
+              <w:t>Explicitly deferred</w:t>
+            </w:r>
+          </w:p>
+        </w:tc>
+        <w:tc>
+          <w:tcPr>
+            <w:tcW w:w="4201" w:type="dxa"/>
+          </w:tcPr>
+          <w:p>
+            <w:pPr>
+              <w:rPr>
+                <w:lang w:val="en-US"/>
+              </w:rPr>
+            </w:pPr>
+            <w:r>
+              <w:rPr>
+                <w:lang w:val="en-US"/>
+              </w:rPr>
+              <w:t>Asset management, emergency service dispatch, contractor payroll.</w:t>
+            </w:r>
+          </w:p>
+        </w:tc>
+      </w:tr>
+    </w:tbl>
+    <w:p>
+      <w:pPr>
+        <w:rPr>
+          <w:lang w:val="en-US"/>
+        </w:rPr>
+      </w:pPr>
+    </w:p>
+    <w:p>
+      <w:pPr>
+        <w:pStyle w:val="Heading3"/>
+        <w:rPr>
+          <w:lang w:val="en-US"/>
+        </w:rPr>
+      </w:pPr>
+      <w:r>
+        <w:rPr>
+          <w:lang w:val="en-US"/>
+        </w:rPr>
+        <w:t>Business Rules</w:t>
+      </w:r>
+    </w:p>
+    <w:p>
+      <w:pPr>
+        <w:rPr>
+          <w:lang w:val="en-US"/>
+        </w:rPr>
+      </w:pPr>
     </w:p>
     <w:sectPr>
       <w:pgSz w:w="11906" w:h="16838"/>
@@ -2427,7 +4544,6 @@
   <w:style w:type="character" w:default="1" w:styleId="DefaultParagraphFont">
     <w:name w:val="Default Paragraph Font"/>
     <w:uiPriority w:val="1"/>
-    <w:semiHidden/>
     <w:unhideWhenUsed/>
   </w:style>
   <w:style w:type="table" w:default="1" w:styleId="TableNormal">

</xml_diff>

<commit_message>
Clarification questions, assumptions, business rules
</commit_message>
<xml_diff>
--- a/report/CA1.docx
+++ b/report/CA1.docx
@@ -3690,6 +3690,1043 @@
         </w:rPr>
         <w:t>Business Rules</w:t>
       </w:r>
+    </w:p>
+    <w:tbl>
+      <w:tblPr>
+        <w:tblStyle w:val="TableGrid"/>
+        <w:tblW w:w="0" w:type="auto"/>
+        <w:tblLook w:val="04A0" w:firstRow="1" w:lastRow="0" w:firstColumn="1" w:lastColumn="0" w:noHBand="0" w:noVBand="1"/>
+      </w:tblPr>
+      <w:tblGrid>
+        <w:gridCol w:w="4508"/>
+        <w:gridCol w:w="4508"/>
+      </w:tblGrid>
+      <w:tr>
+        <w:tc>
+          <w:tcPr>
+            <w:tcW w:w="4508" w:type="dxa"/>
+          </w:tcPr>
+          <w:p>
+            <w:pPr>
+              <w:rPr>
+                <w:lang w:val="en-US"/>
+              </w:rPr>
+            </w:pPr>
+            <w:r>
+              <w:rPr>
+                <w:lang w:val="en-US"/>
+              </w:rPr>
+              <w:t>Business rule</w:t>
+            </w:r>
+          </w:p>
+        </w:tc>
+        <w:tc>
+          <w:tcPr>
+            <w:tcW w:w="4508" w:type="dxa"/>
+          </w:tcPr>
+          <w:p>
+            <w:pPr>
+              <w:rPr>
+                <w:lang w:val="en-US"/>
+              </w:rPr>
+            </w:pPr>
+            <w:r>
+              <w:rPr>
+                <w:lang w:val="en-US"/>
+              </w:rPr>
+              <w:t>Evidence</w:t>
+            </w:r>
+          </w:p>
+        </w:tc>
+      </w:tr>
+      <w:tr>
+        <w:tc>
+          <w:tcPr>
+            <w:tcW w:w="4508" w:type="dxa"/>
+          </w:tcPr>
+          <w:p>
+            <w:pPr>
+              <w:rPr>
+                <w:lang w:val="en-US"/>
+              </w:rPr>
+            </w:pPr>
+            <w:r>
+              <w:rPr>
+                <w:lang w:val="en-US"/>
+              </w:rPr>
+              <w:t>Requests are</w:t>
+            </w:r>
+            <w:r>
+              <w:rPr>
+                <w:lang w:val="en-US"/>
+              </w:rPr>
+              <w:t xml:space="preserve"> accepted only when property, problem time, location</w:t>
+            </w:r>
+            <w:r>
+              <w:rPr>
+                <w:lang w:val="en-US"/>
+              </w:rPr>
+              <w:t>, contact person</w:t>
+            </w:r>
+            <w:r>
+              <w:rPr>
+                <w:lang w:val="en-US"/>
+              </w:rPr>
+              <w:t xml:space="preserve"> and access availability are attached, otherwise it is returned for more information</w:t>
+            </w:r>
+          </w:p>
+        </w:tc>
+        <w:tc>
+          <w:tcPr>
+            <w:tcW w:w="4508" w:type="dxa"/>
+          </w:tcPr>
+          <w:p>
+            <w:pPr>
+              <w:pStyle w:val="Compact"/>
+              <w:spacing w:before="20" w:after="20"/>
+              <w:rPr>
+                <w:lang w:val="en-IE"/>
+              </w:rPr>
+            </w:pPr>
+            <w:r>
+              <w:rPr>
+                <w:lang w:val="en-IE"/>
+              </w:rPr>
+              <w:t>A request normally identifies</w:t>
+            </w:r>
+            <w:r>
+              <w:rPr>
+                <w:lang w:val="en-IE"/>
+              </w:rPr>
+              <w:t>…</w:t>
+            </w:r>
+          </w:p>
+          <w:p>
+            <w:pPr>
+              <w:pStyle w:val="Compact"/>
+              <w:spacing w:before="20" w:after="20"/>
+            </w:pPr>
+            <w:r>
+              <w:rPr>
+                <w:lang w:val="en-IE"/>
+              </w:rPr>
+              <w:t>…</w:t>
+            </w:r>
+            <w:r>
+              <w:rPr>
+                <w:lang w:val="en-IE"/>
+              </w:rPr>
+              <w:t>returned for more information</w:t>
+            </w:r>
+          </w:p>
+          <w:p>
+            <w:pPr>
+              <w:rPr>
+                <w:lang w:val="en-US"/>
+              </w:rPr>
+            </w:pPr>
+          </w:p>
+        </w:tc>
+      </w:tr>
+      <w:tr>
+        <w:tc>
+          <w:tcPr>
+            <w:tcW w:w="4508" w:type="dxa"/>
+          </w:tcPr>
+          <w:p>
+            <w:pPr>
+              <w:rPr>
+                <w:lang w:val="en-US"/>
+              </w:rPr>
+            </w:pPr>
+            <w:r>
+              <w:rPr>
+                <w:lang w:val="en-US"/>
+              </w:rPr>
+              <w:t>A temporary repair “safe for now” won’t complete a request</w:t>
+            </w:r>
+          </w:p>
+        </w:tc>
+        <w:tc>
+          <w:tcPr>
+            <w:tcW w:w="4508" w:type="dxa"/>
+          </w:tcPr>
+          <w:p>
+            <w:pPr>
+              <w:rPr>
+                <w:lang w:val="en-US"/>
+              </w:rPr>
+            </w:pPr>
+            <w:r>
+              <w:rPr>
+                <w:lang w:val="en-US"/>
+              </w:rPr>
+              <w:t>Technician: “Safe for now is not the same as repaired.”</w:t>
+            </w:r>
+          </w:p>
+          <w:p>
+            <w:pPr>
+              <w:rPr>
+                <w:lang w:val="en-US"/>
+              </w:rPr>
+            </w:pPr>
+          </w:p>
+        </w:tc>
+      </w:tr>
+      <w:tr>
+        <w:tc>
+          <w:tcPr>
+            <w:tcW w:w="4508" w:type="dxa"/>
+          </w:tcPr>
+          <w:p>
+            <w:pPr>
+              <w:rPr>
+                <w:lang w:val="en-US"/>
+              </w:rPr>
+            </w:pPr>
+            <w:r>
+              <w:t>A request that requires inspection or occupant confirmation cannot be closed until it is recorded.</w:t>
+            </w:r>
+          </w:p>
+        </w:tc>
+        <w:tc>
+          <w:tcPr>
+            <w:tcW w:w="4508" w:type="dxa"/>
+          </w:tcPr>
+          <w:p>
+            <w:pPr>
+              <w:rPr>
+                <w:lang w:val="en-US"/>
+              </w:rPr>
+            </w:pPr>
+            <w:r>
+              <w:t>S</w:t>
+            </w:r>
+            <w:r>
+              <w:t>ome work requires inspection or occupant confirmation before the request is closed</w:t>
+            </w:r>
+          </w:p>
+        </w:tc>
+      </w:tr>
+      <w:tr>
+        <w:tc>
+          <w:tcPr>
+            <w:tcW w:w="4508" w:type="dxa"/>
+          </w:tcPr>
+          <w:p>
+            <w:r>
+              <w:t>A worker receives only contact, location</w:t>
+            </w:r>
+            <w:r>
+              <w:t xml:space="preserve"> and</w:t>
+            </w:r>
+            <w:r>
+              <w:t xml:space="preserve"> access for the allocated job.</w:t>
+            </w:r>
+          </w:p>
+        </w:tc>
+        <w:tc>
+          <w:tcPr>
+            <w:tcW w:w="4508" w:type="dxa"/>
+          </w:tcPr>
+          <w:p>
+            <w:pPr>
+              <w:rPr>
+                <w:lang w:val="en-US"/>
+              </w:rPr>
+            </w:pPr>
+            <w:r>
+              <w:rPr>
+                <w:lang w:val="en-US"/>
+              </w:rPr>
+              <w:t xml:space="preserve">Caretaker: “A worker may need a </w:t>
+            </w:r>
+            <w:r>
+              <w:rPr>
+                <w:lang w:val="en-US"/>
+              </w:rPr>
+              <w:t>key but</w:t>
+            </w:r>
+            <w:r>
+              <w:rPr>
+                <w:lang w:val="en-US"/>
+              </w:rPr>
+              <w:t xml:space="preserve"> should not receive every occupant’s personal details.”</w:t>
+            </w:r>
+          </w:p>
+          <w:p>
+            <w:pPr>
+              <w:rPr>
+                <w:lang w:val="en-US"/>
+              </w:rPr>
+            </w:pPr>
+          </w:p>
+        </w:tc>
+      </w:tr>
+      <w:tr>
+        <w:tc>
+          <w:tcPr>
+            <w:tcW w:w="4508" w:type="dxa"/>
+          </w:tcPr>
+          <w:p>
+            <w:pPr>
+              <w:rPr>
+                <w:lang w:val="en-US"/>
+              </w:rPr>
+            </w:pPr>
+            <w:r>
+              <w:rPr>
+                <w:lang w:val="en-US"/>
+              </w:rPr>
+              <w:t>External contractor work won’t be started until access and quotation are confirmed</w:t>
+            </w:r>
+          </w:p>
+        </w:tc>
+        <w:tc>
+          <w:tcPr>
+            <w:tcW w:w="4508" w:type="dxa"/>
+          </w:tcPr>
+          <w:p>
+            <w:pPr>
+              <w:rPr>
+                <w:lang w:val="en-US"/>
+              </w:rPr>
+            </w:pPr>
+            <w:r>
+              <w:rPr>
+                <w:lang w:val="en-US"/>
+              </w:rPr>
+              <w:t>Contractor: “I need confirmed access and approval before I commit specialist time.”</w:t>
+            </w:r>
+          </w:p>
+          <w:p>
+            <w:pPr>
+              <w:rPr>
+                <w:lang w:val="en-US"/>
+              </w:rPr>
+            </w:pPr>
+          </w:p>
+        </w:tc>
+      </w:tr>
+    </w:tbl>
+    <w:p>
+      <w:pPr>
+        <w:rPr>
+          <w:lang w:val="en-US"/>
+        </w:rPr>
+      </w:pPr>
+    </w:p>
+    <w:p>
+      <w:pPr>
+        <w:pStyle w:val="Heading3"/>
+        <w:rPr>
+          <w:lang w:val="en-US"/>
+        </w:rPr>
+      </w:pPr>
+      <w:r>
+        <w:rPr>
+          <w:lang w:val="en-US"/>
+        </w:rPr>
+        <w:t>Assumptions, Constraints and Risks</w:t>
+      </w:r>
+    </w:p>
+    <w:tbl>
+      <w:tblPr>
+        <w:tblStyle w:val="TableGrid"/>
+        <w:tblW w:w="0" w:type="auto"/>
+        <w:tblLook w:val="04A0" w:firstRow="1" w:lastRow="0" w:firstColumn="1" w:lastColumn="0" w:noHBand="0" w:noVBand="1"/>
+      </w:tblPr>
+      <w:tblGrid>
+        <w:gridCol w:w="1413"/>
+        <w:gridCol w:w="4597"/>
+        <w:gridCol w:w="3006"/>
+      </w:tblGrid>
+      <w:tr>
+        <w:tc>
+          <w:tcPr>
+            <w:tcW w:w="1413" w:type="dxa"/>
+          </w:tcPr>
+          <w:p>
+            <w:pPr>
+              <w:rPr>
+                <w:lang w:val="en-US"/>
+              </w:rPr>
+            </w:pPr>
+            <w:r>
+              <w:rPr>
+                <w:lang w:val="en-US"/>
+              </w:rPr>
+              <w:t>Type</w:t>
+            </w:r>
+          </w:p>
+        </w:tc>
+        <w:tc>
+          <w:tcPr>
+            <w:tcW w:w="4597" w:type="dxa"/>
+          </w:tcPr>
+          <w:p>
+            <w:pPr>
+              <w:rPr>
+                <w:lang w:val="en-US"/>
+              </w:rPr>
+            </w:pPr>
+            <w:r>
+              <w:rPr>
+                <w:lang w:val="en-US"/>
+              </w:rPr>
+              <w:t>Statement</w:t>
+            </w:r>
+          </w:p>
+        </w:tc>
+        <w:tc>
+          <w:tcPr>
+            <w:tcW w:w="3006" w:type="dxa"/>
+          </w:tcPr>
+          <w:p>
+            <w:pPr>
+              <w:rPr>
+                <w:lang w:val="en-US"/>
+              </w:rPr>
+            </w:pPr>
+            <w:r>
+              <w:rPr>
+                <w:lang w:val="en-US"/>
+              </w:rPr>
+              <w:t>Explanation</w:t>
+            </w:r>
+          </w:p>
+        </w:tc>
+      </w:tr>
+      <w:tr>
+        <w:tc>
+          <w:tcPr>
+            <w:tcW w:w="1413" w:type="dxa"/>
+          </w:tcPr>
+          <w:p>
+            <w:pPr>
+              <w:rPr>
+                <w:lang w:val="en-US"/>
+              </w:rPr>
+            </w:pPr>
+            <w:r>
+              <w:rPr>
+                <w:lang w:val="en-US"/>
+              </w:rPr>
+              <w:t>Assumption</w:t>
+            </w:r>
+          </w:p>
+        </w:tc>
+        <w:tc>
+          <w:tcPr>
+            <w:tcW w:w="4597" w:type="dxa"/>
+          </w:tcPr>
+          <w:p>
+            <w:pPr>
+              <w:rPr>
+                <w:lang w:val="en-US"/>
+              </w:rPr>
+            </w:pPr>
+            <w:r>
+              <w:rPr>
+                <w:lang w:val="en-US"/>
+              </w:rPr>
+              <w:t>Recurring faults have no time limit</w:t>
+            </w:r>
+          </w:p>
+        </w:tc>
+        <w:tc>
+          <w:tcPr>
+            <w:tcW w:w="3006" w:type="dxa"/>
+          </w:tcPr>
+          <w:p>
+            <w:pPr>
+              <w:rPr>
+                <w:lang w:val="en-US"/>
+              </w:rPr>
+            </w:pPr>
+            <w:r>
+              <w:rPr>
+                <w:lang w:val="en-US"/>
+              </w:rPr>
+              <w:t>Requires clarification</w:t>
+            </w:r>
+          </w:p>
+        </w:tc>
+      </w:tr>
+      <w:tr>
+        <w:tc>
+          <w:tcPr>
+            <w:tcW w:w="1413" w:type="dxa"/>
+          </w:tcPr>
+          <w:p>
+            <w:pPr>
+              <w:rPr>
+                <w:lang w:val="en-US"/>
+              </w:rPr>
+            </w:pPr>
+            <w:r>
+              <w:rPr>
+                <w:lang w:val="en-US"/>
+              </w:rPr>
+              <w:t>Assumption</w:t>
+            </w:r>
+          </w:p>
+        </w:tc>
+        <w:tc>
+          <w:tcPr>
+            <w:tcW w:w="4597" w:type="dxa"/>
+          </w:tcPr>
+          <w:p>
+            <w:pPr>
+              <w:rPr>
+                <w:lang w:val="en-US"/>
+              </w:rPr>
+            </w:pPr>
+            <w:r>
+              <w:rPr>
+                <w:lang w:val="en-US"/>
+              </w:rPr>
+              <w:t>Reporters can be contacted by email, phone</w:t>
+            </w:r>
+          </w:p>
+        </w:tc>
+        <w:tc>
+          <w:tcPr>
+            <w:tcW w:w="3006" w:type="dxa"/>
+          </w:tcPr>
+          <w:p>
+            <w:pPr>
+              <w:rPr>
+                <w:lang w:val="en-US"/>
+              </w:rPr>
+            </w:pPr>
+            <w:r>
+              <w:rPr>
+                <w:lang w:val="en-US"/>
+              </w:rPr>
+              <w:t>Probably true</w:t>
+            </w:r>
+          </w:p>
+        </w:tc>
+      </w:tr>
+      <w:tr>
+        <w:tc>
+          <w:tcPr>
+            <w:tcW w:w="1413" w:type="dxa"/>
+          </w:tcPr>
+          <w:p>
+            <w:pPr>
+              <w:rPr>
+                <w:lang w:val="en-US"/>
+              </w:rPr>
+            </w:pPr>
+            <w:r>
+              <w:rPr>
+                <w:lang w:val="en-US"/>
+              </w:rPr>
+              <w:t>Assumption</w:t>
+            </w:r>
+          </w:p>
+        </w:tc>
+        <w:tc>
+          <w:tcPr>
+            <w:tcW w:w="4597" w:type="dxa"/>
+          </w:tcPr>
+          <w:p>
+            <w:pPr>
+              <w:rPr>
+                <w:lang w:val="en-US"/>
+              </w:rPr>
+            </w:pPr>
+            <w:r>
+              <w:t>The coordinator decides what counts as a duplicate.</w:t>
+            </w:r>
+          </w:p>
+        </w:tc>
+        <w:tc>
+          <w:tcPr>
+            <w:tcW w:w="3006" w:type="dxa"/>
+          </w:tcPr>
+          <w:p>
+            <w:pPr>
+              <w:rPr>
+                <w:lang w:val="en-US"/>
+              </w:rPr>
+            </w:pPr>
+            <w:r>
+              <w:rPr>
+                <w:lang w:val="en-US"/>
+              </w:rPr>
+              <w:t>Must be verified</w:t>
+            </w:r>
+          </w:p>
+        </w:tc>
+      </w:tr>
+      <w:tr>
+        <w:tc>
+          <w:tcPr>
+            <w:tcW w:w="1413" w:type="dxa"/>
+          </w:tcPr>
+          <w:p>
+            <w:pPr>
+              <w:rPr>
+                <w:lang w:val="en-US"/>
+              </w:rPr>
+            </w:pPr>
+            <w:r>
+              <w:rPr>
+                <w:lang w:val="en-US"/>
+              </w:rPr>
+              <w:t>Constraint</w:t>
+            </w:r>
+          </w:p>
+        </w:tc>
+        <w:tc>
+          <w:tcPr>
+            <w:tcW w:w="4597" w:type="dxa"/>
+          </w:tcPr>
+          <w:p>
+            <w:pPr>
+              <w:rPr>
+                <w:lang w:val="en-US"/>
+              </w:rPr>
+            </w:pPr>
+            <w:r>
+              <w:rPr>
+                <w:lang w:val="en-US"/>
+              </w:rPr>
+              <w:t>Invoicing remains in separate finance system</w:t>
+            </w:r>
+          </w:p>
+        </w:tc>
+        <w:tc>
+          <w:tcPr>
+            <w:tcW w:w="3006" w:type="dxa"/>
+          </w:tcPr>
+          <w:p>
+            <w:pPr>
+              <w:rPr>
+                <w:lang w:val="en-US"/>
+              </w:rPr>
+            </w:pPr>
+            <w:r>
+              <w:rPr>
+                <w:lang w:val="en-US"/>
+              </w:rPr>
+              <w:t>Restrict the solution</w:t>
+            </w:r>
+          </w:p>
+        </w:tc>
+      </w:tr>
+      <w:tr>
+        <w:tc>
+          <w:tcPr>
+            <w:tcW w:w="1413" w:type="dxa"/>
+          </w:tcPr>
+          <w:p>
+            <w:pPr>
+              <w:rPr>
+                <w:lang w:val="en-US"/>
+              </w:rPr>
+            </w:pPr>
+            <w:r>
+              <w:rPr>
+                <w:lang w:val="en-US"/>
+              </w:rPr>
+              <w:t>Constraint</w:t>
+            </w:r>
+          </w:p>
+        </w:tc>
+        <w:tc>
+          <w:tcPr>
+            <w:tcW w:w="4597" w:type="dxa"/>
+          </w:tcPr>
+          <w:p>
+            <w:pPr>
+              <w:rPr>
+                <w:lang w:val="en-US"/>
+              </w:rPr>
+            </w:pPr>
+            <w:r>
+              <w:rPr>
+                <w:lang w:val="en-US"/>
+              </w:rPr>
+              <w:t>External contractors are separate firms</w:t>
+            </w:r>
+          </w:p>
+        </w:tc>
+        <w:tc>
+          <w:tcPr>
+            <w:tcW w:w="3006" w:type="dxa"/>
+          </w:tcPr>
+          <w:p>
+            <w:pPr>
+              <w:rPr>
+                <w:lang w:val="en-US"/>
+              </w:rPr>
+            </w:pPr>
+            <w:r>
+              <w:rPr>
+                <w:lang w:val="en-US"/>
+              </w:rPr>
+              <w:t>KCPS can’t control them completely</w:t>
+            </w:r>
+          </w:p>
+        </w:tc>
+      </w:tr>
+      <w:tr>
+        <w:tc>
+          <w:tcPr>
+            <w:tcW w:w="1413" w:type="dxa"/>
+          </w:tcPr>
+          <w:p>
+            <w:pPr>
+              <w:rPr>
+                <w:lang w:val="en-US"/>
+              </w:rPr>
+            </w:pPr>
+            <w:r>
+              <w:rPr>
+                <w:lang w:val="en-US"/>
+              </w:rPr>
+              <w:t>Risk</w:t>
+            </w:r>
+          </w:p>
+        </w:tc>
+        <w:tc>
+          <w:tcPr>
+            <w:tcW w:w="4597" w:type="dxa"/>
+          </w:tcPr>
+          <w:p>
+            <w:pPr>
+              <w:rPr>
+                <w:lang w:val="en-US"/>
+              </w:rPr>
+            </w:pPr>
+            <w:r>
+              <w:rPr>
+                <w:lang w:val="en-US"/>
+              </w:rPr>
+              <w:t>Priority classification is not agreed</w:t>
+            </w:r>
+          </w:p>
+        </w:tc>
+        <w:tc>
+          <w:tcPr>
+            <w:tcW w:w="3006" w:type="dxa"/>
+          </w:tcPr>
+          <w:p>
+            <w:pPr>
+              <w:rPr>
+                <w:lang w:val="en-US"/>
+              </w:rPr>
+            </w:pPr>
+            <w:r>
+              <w:rPr>
+                <w:lang w:val="en-US"/>
+              </w:rPr>
+              <w:t>May lead to misleading of priority</w:t>
+            </w:r>
+          </w:p>
+        </w:tc>
+      </w:tr>
+      <w:tr>
+        <w:tc>
+          <w:tcPr>
+            <w:tcW w:w="1413" w:type="dxa"/>
+          </w:tcPr>
+          <w:p>
+            <w:pPr>
+              <w:rPr>
+                <w:lang w:val="en-US"/>
+              </w:rPr>
+            </w:pPr>
+            <w:r>
+              <w:rPr>
+                <w:lang w:val="en-US"/>
+              </w:rPr>
+              <w:t>Risk</w:t>
+            </w:r>
+          </w:p>
+        </w:tc>
+        <w:tc>
+          <w:tcPr>
+            <w:tcW w:w="4597" w:type="dxa"/>
+          </w:tcPr>
+          <w:p>
+            <w:pPr>
+              <w:rPr>
+                <w:lang w:val="en-US"/>
+              </w:rPr>
+            </w:pPr>
+            <w:r>
+              <w:rPr>
+                <w:lang w:val="en-US"/>
+              </w:rPr>
+              <w:t>No metric on how to distinguish failed access, cancellation or contractor delay</w:t>
+            </w:r>
+          </w:p>
+        </w:tc>
+        <w:tc>
+          <w:tcPr>
+            <w:tcW w:w="3006" w:type="dxa"/>
+          </w:tcPr>
+          <w:p>
+            <w:pPr>
+              <w:rPr>
+                <w:lang w:val="en-US"/>
+              </w:rPr>
+            </w:pPr>
+            <w:r>
+              <w:rPr>
+                <w:lang w:val="en-US"/>
+              </w:rPr>
+              <w:t>Wasted time, money, reputation</w:t>
+            </w:r>
+          </w:p>
+        </w:tc>
+      </w:tr>
+    </w:tbl>
+    <w:p>
+      <w:pPr>
+        <w:rPr>
+          <w:lang w:val="en-US"/>
+        </w:rPr>
+      </w:pPr>
+    </w:p>
+    <w:p>
+      <w:pPr>
+        <w:rPr>
+          <w:lang w:val="en-US"/>
+        </w:rPr>
+      </w:pPr>
+    </w:p>
+    <w:p>
+      <w:pPr>
+        <w:rPr>
+          <w:lang w:val="en-US"/>
+        </w:rPr>
+      </w:pPr>
+    </w:p>
+    <w:p>
+      <w:pPr>
+        <w:pStyle w:val="Heading2"/>
+        <w:rPr>
+          <w:lang w:val="en-US"/>
+        </w:rPr>
+      </w:pPr>
+      <w:r>
+        <w:rPr>
+          <w:lang w:val="en-US"/>
+        </w:rPr>
+        <w:t>Clarification Questions</w:t>
+      </w:r>
+    </w:p>
+    <w:tbl>
+      <w:tblPr>
+        <w:tblStyle w:val="TableGrid"/>
+        <w:tblW w:w="0" w:type="auto"/>
+        <w:tblLook w:val="04A0" w:firstRow="1" w:lastRow="0" w:firstColumn="1" w:lastColumn="0" w:noHBand="0" w:noVBand="1"/>
+      </w:tblPr>
+      <w:tblGrid>
+        <w:gridCol w:w="9016"/>
+      </w:tblGrid>
+      <w:tr>
+        <w:tc>
+          <w:tcPr>
+            <w:tcW w:w="9016" w:type="dxa"/>
+          </w:tcPr>
+          <w:p>
+            <w:pPr>
+              <w:rPr>
+                <w:lang w:val="en-US"/>
+              </w:rPr>
+            </w:pPr>
+            <w:r>
+              <w:rPr>
+                <w:lang w:val="en-US"/>
+              </w:rPr>
+              <w:t>Question</w:t>
+            </w:r>
+          </w:p>
+        </w:tc>
+      </w:tr>
+      <w:tr>
+        <w:tc>
+          <w:tcPr>
+            <w:tcW w:w="9016" w:type="dxa"/>
+          </w:tcPr>
+          <w:p>
+            <w:pPr>
+              <w:rPr>
+                <w:lang w:val="en-US"/>
+              </w:rPr>
+            </w:pPr>
+            <w:r>
+              <w:rPr>
+                <w:lang w:val="en-US"/>
+              </w:rPr>
+              <w:t>How are emergency, urgent and routine circumstances defined?</w:t>
+            </w:r>
+          </w:p>
+        </w:tc>
+      </w:tr>
+      <w:tr>
+        <w:tc>
+          <w:tcPr>
+            <w:tcW w:w="9016" w:type="dxa"/>
+          </w:tcPr>
+          <w:p>
+            <w:pPr>
+              <w:rPr>
+                <w:lang w:val="en-US"/>
+              </w:rPr>
+            </w:pPr>
+            <w:r>
+              <w:rPr>
+                <w:lang w:val="en-US"/>
+              </w:rPr>
+              <w:t>When are two reports duplicates?</w:t>
+            </w:r>
+          </w:p>
+        </w:tc>
+      </w:tr>
+      <w:tr>
+        <w:tc>
+          <w:tcPr>
+            <w:tcW w:w="9016" w:type="dxa"/>
+          </w:tcPr>
+          <w:p>
+            <w:pPr>
+              <w:rPr>
+                <w:lang w:val="en-US"/>
+              </w:rPr>
+            </w:pPr>
+            <w:r>
+              <w:rPr>
+                <w:lang w:val="en-US"/>
+              </w:rPr>
+              <w:t xml:space="preserve">Who must confirm completion and when a closed request may be reopened? </w:t>
+            </w:r>
+          </w:p>
+        </w:tc>
+      </w:tr>
+      <w:tr>
+        <w:tc>
+          <w:tcPr>
+            <w:tcW w:w="9016" w:type="dxa"/>
+          </w:tcPr>
+          <w:p>
+            <w:pPr>
+              <w:rPr>
+                <w:lang w:val="en-US"/>
+              </w:rPr>
+            </w:pPr>
+            <w:r>
+              <w:rPr>
+                <w:lang w:val="en-US"/>
+              </w:rPr>
+              <w:t>How failed access, cancellation and contractor delay should be distinguished?</w:t>
+            </w:r>
+          </w:p>
+        </w:tc>
+      </w:tr>
+      <w:tr>
+        <w:tc>
+          <w:tcPr>
+            <w:tcW w:w="9016" w:type="dxa"/>
+          </w:tcPr>
+          <w:p>
+            <w:pPr>
+              <w:rPr>
+                <w:lang w:val="en-US"/>
+              </w:rPr>
+            </w:pPr>
+            <w:r>
+              <w:rPr>
+                <w:lang w:val="en-US"/>
+              </w:rPr>
+              <w:t>Who may approve external contractors, quotations and temporary repairs?</w:t>
+            </w:r>
+          </w:p>
+        </w:tc>
+      </w:tr>
+      <w:tr>
+        <w:tc>
+          <w:tcPr>
+            <w:tcW w:w="9016" w:type="dxa"/>
+          </w:tcPr>
+          <w:p>
+            <w:pPr>
+              <w:rPr>
+                <w:lang w:val="en-US"/>
+              </w:rPr>
+            </w:pPr>
+            <w:r>
+              <w:t>W</w:t>
+            </w:r>
+            <w:r>
+              <w:t>hen a temporary repair allows a request to pause or requires continued escalation</w:t>
+            </w:r>
+            <w:r>
+              <w:t>?</w:t>
+            </w:r>
+          </w:p>
+        </w:tc>
+      </w:tr>
+      <w:tr>
+        <w:tc>
+          <w:tcPr>
+            <w:tcW w:w="9016" w:type="dxa"/>
+          </w:tcPr>
+          <w:p>
+            <w:pPr>
+              <w:rPr>
+                <w:lang w:val="en-US"/>
+              </w:rPr>
+            </w:pPr>
+            <w:r>
+              <w:rPr>
+                <w:lang w:val="en-US"/>
+              </w:rPr>
+              <w:t>W</w:t>
+            </w:r>
+            <w:r>
+              <w:rPr>
+                <w:lang w:val="en-US"/>
+              </w:rPr>
+              <w:t xml:space="preserve">hich occupant, property, access and commercial information </w:t>
+            </w:r>
+            <w:proofErr w:type="gramStart"/>
+            <w:r>
+              <w:rPr>
+                <w:lang w:val="en-US"/>
+              </w:rPr>
+              <w:t>each role may</w:t>
+            </w:r>
+            <w:proofErr w:type="gramEnd"/>
+            <w:r>
+              <w:rPr>
+                <w:lang w:val="en-US"/>
+              </w:rPr>
+              <w:t xml:space="preserve"> see</w:t>
+            </w:r>
+            <w:r>
+              <w:rPr>
+                <w:lang w:val="en-US"/>
+              </w:rPr>
+              <w:t>?</w:t>
+            </w:r>
+          </w:p>
+        </w:tc>
+      </w:tr>
+    </w:tbl>
+    <w:p>
+      <w:pPr>
+        <w:rPr>
+          <w:lang w:val="en-US"/>
+        </w:rPr>
+      </w:pPr>
     </w:p>
     <w:p>
       <w:pPr>
@@ -4883,6 +5920,42 @@
       </w:tblBorders>
     </w:tblPr>
   </w:style>
+  <w:style w:type="paragraph" w:customStyle="1" w:styleId="Compact">
+    <w:name w:val="Compact"/>
+    <w:basedOn w:val="BodyText"/>
+    <w:qFormat/>
+    <w:rsid w:val="001506FC"/>
+    <w:pPr>
+      <w:spacing w:before="36" w:after="36" w:line="240" w:lineRule="auto"/>
+    </w:pPr>
+    <w:rPr>
+      <w:rFonts w:ascii="Calibri" w:eastAsia="Calibri" w:hAnsi="Calibri"/>
+      <w:kern w:val="0"/>
+      <w:szCs w:val="24"/>
+      <w:lang w:val="en-US"/>
+      <w14:ligatures w14:val="none"/>
+    </w:rPr>
+  </w:style>
+  <w:style w:type="paragraph" w:styleId="BodyText">
+    <w:name w:val="Body Text"/>
+    <w:basedOn w:val="Normal"/>
+    <w:link w:val="BodyTextChar"/>
+    <w:uiPriority w:val="99"/>
+    <w:semiHidden/>
+    <w:unhideWhenUsed/>
+    <w:rsid w:val="001506FC"/>
+    <w:pPr>
+      <w:spacing w:after="120"/>
+    </w:pPr>
+  </w:style>
+  <w:style w:type="character" w:customStyle="1" w:styleId="BodyTextChar">
+    <w:name w:val="Body Text Char"/>
+    <w:basedOn w:val="DefaultParagraphFont"/>
+    <w:link w:val="BodyText"/>
+    <w:uiPriority w:val="99"/>
+    <w:semiHidden/>
+    <w:rsid w:val="001506FC"/>
+  </w:style>
 </w:styles>
 </file>
 

</xml_diff>